<commit_message>
fixed readme and updated AI log
</commit_message>
<xml_diff>
--- a/Assignment1Report.docx
+++ b/Assignment1Report.docx
@@ -1144,25 +1144,7 @@
                 <w:sz w:val="16"/>
                 <w:szCs w:val="16"/>
               </w:rPr>
-              <w:t xml:space="preserve"> I understand that if this assignment is submitted after the due </w:t>
-            </w:r>
-            <w:proofErr w:type="gramStart"/>
-            <w:r>
-              <w:rPr>
-                <w:rFonts w:ascii="Arial" w:eastAsia="Arial Unicode MS" w:hAnsi="Arial" w:cs="Arial"/>
-                <w:sz w:val="16"/>
-                <w:szCs w:val="16"/>
-              </w:rPr>
-              <w:t>date</w:t>
-            </w:r>
-            <w:proofErr w:type="gramEnd"/>
-            <w:r>
-              <w:rPr>
-                <w:rFonts w:ascii="Arial" w:eastAsia="Arial Unicode MS" w:hAnsi="Arial" w:cs="Arial"/>
-                <w:sz w:val="16"/>
-                <w:szCs w:val="16"/>
-              </w:rPr>
-              <w:t xml:space="preserve"> it may incur a penalty for lateness unless I have previously had an extension of time approved and have attached the written confirmation of this extension.</w:t>
+              <w:t xml:space="preserve"> I understand that if this assignment is submitted after the due date it may incur a penalty for lateness unless I have previously had an extension of time approved and have attached the written confirmation of this extension.</w:t>
             </w:r>
           </w:p>
           <w:p>
@@ -1226,23 +1208,7 @@
                 <w:rFonts w:ascii="Arial" w:eastAsia="Arial Unicode MS" w:hAnsi="Arial" w:cs="Arial"/>
                 <w:sz w:val="16"/>
               </w:rPr>
-              <w:t xml:space="preserve">that, should this declaration be found to be false, disciplinary action could be taken and penalties imposed in accordance with </w:t>
-            </w:r>
-            <w:proofErr w:type="gramStart"/>
-            <w:r>
-              <w:rPr>
-                <w:rFonts w:ascii="Arial" w:eastAsia="Arial Unicode MS" w:hAnsi="Arial" w:cs="Arial"/>
-                <w:sz w:val="16"/>
-              </w:rPr>
-              <w:t>University</w:t>
-            </w:r>
-            <w:proofErr w:type="gramEnd"/>
-            <w:r>
-              <w:rPr>
-                <w:rFonts w:ascii="Arial" w:eastAsia="Arial Unicode MS" w:hAnsi="Arial" w:cs="Arial"/>
-                <w:sz w:val="16"/>
-              </w:rPr>
-              <w:t xml:space="preserve"> policy and rules. In the statement below, I have indicated the extent to which I have collaborated with others, whom I have named.</w:t>
+              <w:t>that, should this declaration be found to be false, disciplinary action could be taken and penalties imposed in accordance with University policy and rules. In the statement below, I have indicated the extent to which I have collaborated with others, whom I have named.</w:t>
             </w:r>
           </w:p>
           <w:p>
@@ -2175,23 +2141,7 @@
                 <w:rFonts w:ascii="Arial" w:hAnsi="Arial" w:cs="Arial"/>
                 <w:sz w:val="20"/>
               </w:rPr>
-              <w:t xml:space="preserve">: use the correct genre and language style expected for the </w:t>
-            </w:r>
-            <w:proofErr w:type="gramStart"/>
-            <w:r>
-              <w:rPr>
-                <w:rFonts w:ascii="Arial" w:hAnsi="Arial" w:cs="Arial"/>
-                <w:sz w:val="20"/>
-              </w:rPr>
-              <w:t>particular task</w:t>
-            </w:r>
-            <w:proofErr w:type="gramEnd"/>
-            <w:r>
-              <w:rPr>
-                <w:rFonts w:ascii="Arial" w:hAnsi="Arial" w:cs="Arial"/>
-                <w:sz w:val="20"/>
-              </w:rPr>
-              <w:t>.</w:t>
+              <w:t>: use the correct genre and language style expected for the particular task.</w:t>
             </w:r>
           </w:p>
           <w:p>
@@ -2360,66 +2310,30 @@
                 <w:rFonts w:ascii="Arial" w:hAnsi="Arial" w:cs="Arial"/>
                 <w:sz w:val="20"/>
               </w:rPr>
-              <w:t xml:space="preserve">ISO (International Organisation for Standardisation) for writing dates and times for international documents. For </w:t>
-            </w:r>
-            <w:proofErr w:type="gramStart"/>
-            <w:r>
-              <w:rPr>
-                <w:rFonts w:ascii="Arial" w:hAnsi="Arial" w:cs="Arial"/>
-                <w:sz w:val="20"/>
-              </w:rPr>
-              <w:t>example</w:t>
-            </w:r>
-            <w:proofErr w:type="gramEnd"/>
-            <w:r>
-              <w:rPr>
-                <w:rFonts w:ascii="Arial" w:hAnsi="Arial" w:cs="Arial"/>
-                <w:sz w:val="20"/>
-              </w:rPr>
-              <w:t xml:space="preserve"> </w:t>
-            </w:r>
-            <w:proofErr w:type="spellStart"/>
+              <w:t xml:space="preserve">ISO (International Organisation for Standardisation) for writing dates and times for international documents. For example </w:t>
+            </w:r>
             <w:r>
               <w:rPr>
                 <w:rFonts w:ascii="Arial" w:hAnsi="Arial" w:cs="Arial"/>
                 <w:b/>
                 <w:sz w:val="20"/>
               </w:rPr>
-              <w:t>yyyy</w:t>
-            </w:r>
-            <w:proofErr w:type="spellEnd"/>
+              <w:t xml:space="preserve">yyyy-mm-dd </w:t>
+            </w:r>
+            <w:r>
+              <w:rPr>
+                <w:rFonts w:ascii="Arial" w:hAnsi="Arial" w:cs="Arial"/>
+                <w:sz w:val="20"/>
+              </w:rPr>
+              <w:t xml:space="preserve">or </w:t>
+            </w:r>
             <w:r>
               <w:rPr>
                 <w:rFonts w:ascii="Arial" w:hAnsi="Arial" w:cs="Arial"/>
                 <w:b/>
                 <w:sz w:val="20"/>
               </w:rPr>
-              <w:t xml:space="preserve">-mm-dd </w:t>
-            </w:r>
-            <w:r>
-              <w:rPr>
-                <w:rFonts w:ascii="Arial" w:hAnsi="Arial" w:cs="Arial"/>
-                <w:sz w:val="20"/>
-              </w:rPr>
-              <w:t xml:space="preserve">or </w:t>
-            </w:r>
-            <w:proofErr w:type="spellStart"/>
-            <w:r>
-              <w:rPr>
-                <w:rFonts w:ascii="Arial" w:hAnsi="Arial" w:cs="Arial"/>
-                <w:b/>
-                <w:sz w:val="20"/>
-              </w:rPr>
-              <w:t>hh</w:t>
-            </w:r>
-            <w:proofErr w:type="spellEnd"/>
-            <w:r>
-              <w:rPr>
-                <w:rFonts w:ascii="Arial" w:hAnsi="Arial" w:cs="Arial"/>
-                <w:b/>
-                <w:sz w:val="20"/>
-              </w:rPr>
-              <w:t>-mm-ss</w:t>
+              <w:t>hh-mm-ss</w:t>
             </w:r>
             <w:r>
               <w:rPr>
@@ -5127,11 +5041,9 @@
           <w:numId w:val="35"/>
         </w:numPr>
       </w:pPr>
-      <w:proofErr w:type="spellStart"/>
       <w:r>
         <w:t>priority_queue</w:t>
       </w:r>
-      <w:proofErr w:type="spellEnd"/>
     </w:p>
     <w:p>
       <w:pPr>
@@ -5141,11 +5053,9 @@
           <w:numId w:val="35"/>
         </w:numPr>
       </w:pPr>
-      <w:proofErr w:type="spellStart"/>
       <w:r>
         <w:t>unordered_map</w:t>
       </w:r>
-      <w:proofErr w:type="spellEnd"/>
     </w:p>
     <w:p>
       <w:pPr>
@@ -5200,23 +5110,7 @@
         <w:t xml:space="preserve"> This representation is useful as </w:t>
       </w:r>
       <w:r>
-        <w:t xml:space="preserve">it can be hashed and used as a key in an </w:t>
-      </w:r>
-      <w:proofErr w:type="spellStart"/>
-      <w:r>
-        <w:t>unordered_map</w:t>
-      </w:r>
-      <w:proofErr w:type="spellEnd"/>
-      <w:r>
-        <w:t xml:space="preserve"> or </w:t>
-      </w:r>
-      <w:proofErr w:type="spellStart"/>
-      <w:r>
-        <w:t>unordered_set</w:t>
-      </w:r>
-      <w:proofErr w:type="spellEnd"/>
-      <w:r>
-        <w:t>.</w:t>
+        <w:t>it can be hashed and used as a key in an unordered_map or unordered_set.</w:t>
       </w:r>
     </w:p>
     <w:p/>
@@ -5229,15 +5123,7 @@
         <w:t xml:space="preserve"> but represents a 2D grid, the column and row numbers of </w:t>
       </w:r>
       <w:r>
-        <w:t>an index ‘</w:t>
-      </w:r>
-      <w:proofErr w:type="spellStart"/>
-      <w:r>
-        <w:t>i</w:t>
-      </w:r>
-      <w:proofErr w:type="spellEnd"/>
-      <w:r>
-        <w:t>’</w:t>
+        <w:t>an index ‘i’</w:t>
       </w:r>
       <w:r>
         <w:t xml:space="preserve"> are determined by:</w:t>
@@ -5252,15 +5138,7 @@
         </w:numPr>
       </w:pPr>
       <w:r>
-        <w:t xml:space="preserve">row = </w:t>
-      </w:r>
-      <w:proofErr w:type="spellStart"/>
-      <w:r>
-        <w:t>i</w:t>
-      </w:r>
-      <w:proofErr w:type="spellEnd"/>
-      <w:r>
-        <w:t xml:space="preserve"> / </w:t>
+        <w:t xml:space="preserve">row = i / </w:t>
       </w:r>
       <w:r>
         <w:t>4</w:t>
@@ -5275,15 +5153,7 @@
         </w:numPr>
       </w:pPr>
       <w:r>
-        <w:t xml:space="preserve">col = </w:t>
-      </w:r>
-      <w:proofErr w:type="spellStart"/>
-      <w:r>
-        <w:t>i</w:t>
-      </w:r>
-      <w:proofErr w:type="spellEnd"/>
-      <w:r>
-        <w:t xml:space="preserve"> % 4</w:t>
+        <w:t>col = i % 4</w:t>
       </w:r>
     </w:p>
     <w:p/>
@@ -5295,29 +5165,13 @@
     <w:p/>
     <w:p>
       <w:r>
-        <w:t xml:space="preserve">A move is represented by an </w:t>
-      </w:r>
-      <w:proofErr w:type="spellStart"/>
-      <w:r>
-        <w:t>enum</w:t>
-      </w:r>
-      <w:proofErr w:type="spellEnd"/>
-      <w:r>
-        <w:t xml:space="preserve">, with Up, Down, Left and Right. </w:t>
+        <w:t xml:space="preserve">A move is represented by an enum, with Up, Down, Left and Right. </w:t>
       </w:r>
       <w:r>
         <w:t>A move means moving the ‘0’ (blank tile) one space in that direction.</w:t>
       </w:r>
       <w:r>
-        <w:t xml:space="preserve"> Internally this is done using </w:t>
-      </w:r>
-      <w:proofErr w:type="gramStart"/>
-      <w:r>
-        <w:t>std::</w:t>
-      </w:r>
-      <w:proofErr w:type="gramEnd"/>
-      <w:r>
-        <w:t xml:space="preserve">swap. </w:t>
+        <w:t xml:space="preserve"> Internally this is done using std::swap. </w:t>
       </w:r>
     </w:p>
     <w:p/>
@@ -5335,15 +5189,7 @@
         <w:t xml:space="preserve">The board itself does not contain enough information for the A* algorithm to operate. </w:t>
       </w:r>
       <w:r>
-        <w:t>Therefore, a struct ‘</w:t>
-      </w:r>
-      <w:proofErr w:type="spellStart"/>
-      <w:r>
-        <w:t>SearchNode</w:t>
-      </w:r>
-      <w:proofErr w:type="spellEnd"/>
-      <w:r>
-        <w:t>’</w:t>
+        <w:t>Therefore, a struct ‘SearchNode’</w:t>
       </w:r>
       <w:r>
         <w:t>, containing the PuzzleState, cost from start</w:t>
@@ -5423,26 +5269,10 @@
     <w:p/>
     <w:p>
       <w:r>
-        <w:t xml:space="preserve">An </w:t>
-      </w:r>
-      <w:proofErr w:type="spellStart"/>
-      <w:r>
-        <w:t>unordered_map</w:t>
-      </w:r>
-      <w:proofErr w:type="spellEnd"/>
-      <w:r>
-        <w:t xml:space="preserve"> </w:t>
-      </w:r>
-      <w:r>
-        <w:t>‘</w:t>
-      </w:r>
-      <w:proofErr w:type="spellStart"/>
-      <w:r>
-        <w:t>bestCost</w:t>
-      </w:r>
-      <w:proofErr w:type="spellEnd"/>
-      <w:r>
-        <w:t xml:space="preserve">’ stores PuzzleState and lowest known </w:t>
+        <w:t xml:space="preserve">An unordered_map </w:t>
+      </w:r>
+      <w:r>
+        <w:t xml:space="preserve">‘bestCost’ stores PuzzleState and lowest known </w:t>
       </w:r>
       <m:oMath>
         <m:r>
@@ -5540,15 +5370,7 @@
     <w:p/>
     <w:p>
       <w:r>
-        <w:t xml:space="preserve">The key design decision is that the board state is independent of the search information. The same PuzzleState can be encountered by multiple search nodes, potentially through different paths, which is why </w:t>
-      </w:r>
-      <w:proofErr w:type="spellStart"/>
-      <w:r>
-        <w:t>bestCost</w:t>
-      </w:r>
-      <w:proofErr w:type="spellEnd"/>
-      <w:r>
-        <w:t xml:space="preserve"> and the parent pointer are kept separately.</w:t>
+        <w:t>The key design decision is that the board state is independent of the search information. The same PuzzleState can be encountered by multiple search nodes, potentially through different paths, which is why bestCost and the parent pointer are kept separately.</w:t>
       </w:r>
     </w:p>
     <w:p/>
@@ -5710,15 +5532,7 @@
         <w:t>. O</w:t>
       </w:r>
       <w:r>
-        <w:t xml:space="preserve">ne of them </w:t>
-      </w:r>
-      <w:proofErr w:type="gramStart"/>
-      <w:r>
-        <w:t>has to</w:t>
-      </w:r>
-      <w:proofErr w:type="gramEnd"/>
-      <w:r>
-        <w:t xml:space="preserve"> step out of the line to let the other pass, then step back in.</w:t>
+        <w:t>ne of them has to step out of the line to let the other pass, then step back in.</w:t>
       </w:r>
     </w:p>
     <w:p/>
@@ -6066,15 +5880,7 @@
     <w:p/>
     <w:p>
       <w:r>
-        <w:t xml:space="preserve">The implementation also maintains the </w:t>
-      </w:r>
-      <w:proofErr w:type="gramStart"/>
-      <w:r>
-        <w:t>best known</w:t>
-      </w:r>
-      <w:proofErr w:type="gramEnd"/>
-      <w:r>
-        <w:t xml:space="preserve"> cost for previously encountered states. This prevents the algorithm from repeatedly exploring the same configuration through more expensive paths.</w:t>
+        <w:t>The implementation also maintains the best known cost for previously encountered states. This prevents the algorithm from repeatedly exploring the same configuration through more expensive paths.</w:t>
       </w:r>
     </w:p>
     <w:p/>
@@ -7032,13 +6838,7 @@
               <w:rPr>
                 <w:rFonts w:ascii="Times New Roman" w:hAnsi="Times New Roman" w:cs="Times New Roman"/>
               </w:rPr>
-              <w:t>Up (swap with 7</w:t>
-            </w:r>
-            <w:r>
-              <w:rPr>
-                <w:rFonts w:ascii="Times New Roman" w:hAnsi="Times New Roman" w:cs="Times New Roman"/>
-              </w:rPr>
-              <w:t>)</w:t>
+              <w:t>Up (swap with 7)</w:t>
             </w:r>
           </w:p>
         </w:tc>
@@ -7450,13 +7250,7 @@
         <w:t>s</w:t>
       </w:r>
       <w:r>
-        <w:t xml:space="preserve">es it as the move that </w:t>
-      </w:r>
-      <w:r>
-        <w:t>makes</w:t>
-      </w:r>
-      <w:r>
-        <w:t xml:space="preserve"> progress, since it's the one that resolves a tile completely.</w:t>
+        <w:t>es it as the move that makes progress, since it's the one that resolves a tile completely.</w:t>
       </w:r>
     </w:p>
     <w:p/>
@@ -7466,19 +7260,7 @@
       </w:pPr>
       <w:bookmarkStart w:id="27" w:name="_Toc241314110"/>
       <w:r>
-        <w:t>Step 2</w:t>
-      </w:r>
-      <w:r>
-        <w:t>:</w:t>
-      </w:r>
-      <w:r>
-        <w:t xml:space="preserve"> </w:t>
-      </w:r>
-      <w:r>
-        <w:t>P</w:t>
-      </w:r>
-      <w:r>
-        <w:t>op the lowest-f node</w:t>
+        <w:t>Step 2: Pop the lowest-f node</w:t>
       </w:r>
       <w:bookmarkEnd w:id="27"/>
     </w:p>
@@ -7571,13 +7353,7 @@
           <w:rPr>
             <w:rFonts w:ascii="Cambria Math" w:hAnsi="Cambria Math"/>
           </w:rPr>
-          <m:t xml:space="preserve">h = </m:t>
-        </m:r>
-        <m:r>
-          <w:rPr>
-            <w:rFonts w:ascii="Cambria Math" w:hAnsi="Cambria Math"/>
-          </w:rPr>
-          <m:t>0  g = 2 → f = 2</m:t>
+          <m:t>h = 0  g = 2 → f = 2</m:t>
         </m:r>
       </m:oMath>
       <w:r>
@@ -7674,17 +7450,8 @@
           <w:b/>
           <w:bCs/>
         </w:rPr>
-        <w:t xml:space="preserve">Right, </w:t>
-      </w:r>
-      <w:proofErr w:type="gramStart"/>
-      <w:r>
-        <w:rPr>
-          <w:b/>
-          <w:bCs/>
-        </w:rPr>
-        <w:t>Down</w:t>
-      </w:r>
-      <w:proofErr w:type="gramEnd"/>
+        <w:t>Right, Down</w:t>
+      </w:r>
       <w:r>
         <w:t>.</w:t>
       </w:r>
@@ -7914,31 +7681,10 @@
         <w:t>a</w:t>
       </w:r>
       <w:r>
-        <w:t xml:space="preserve">n </w:t>
-      </w:r>
-      <w:proofErr w:type="gramStart"/>
-      <w:r>
-        <w:t>std::</w:t>
-      </w:r>
-      <w:proofErr w:type="spellStart"/>
-      <w:proofErr w:type="gramEnd"/>
-      <w:r>
-        <w:t>unordered_map</w:t>
-      </w:r>
-      <w:proofErr w:type="spellEnd"/>
-      <w:r>
-        <w:t xml:space="preserve"> </w:t>
-      </w:r>
-      <w:r>
-        <w:t>(</w:t>
-      </w:r>
-      <w:proofErr w:type="spellStart"/>
-      <w:r>
-        <w:t>bestCost</w:t>
-      </w:r>
-      <w:proofErr w:type="spellEnd"/>
-      <w:r>
-        <w:t xml:space="preserve">) </w:t>
+        <w:t xml:space="preserve">n std::unordered_map </w:t>
+      </w:r>
+      <w:r>
+        <w:t xml:space="preserve">(bestCost) </w:t>
       </w:r>
       <w:r>
         <w:t xml:space="preserve">in the algorithm that keeps track of the best score for visited states. </w:t>
@@ -8002,18 +7748,8 @@
       <w:r>
         <w:t xml:space="preserve">consultation with GenAI models I learnt how the path reconstruction functions. </w:t>
       </w:r>
-      <w:proofErr w:type="gramStart"/>
-      <w:r>
-        <w:t>std::</w:t>
-      </w:r>
-      <w:proofErr w:type="spellStart"/>
-      <w:proofErr w:type="gramEnd"/>
-      <w:r>
-        <w:t>shared_ptr</w:t>
-      </w:r>
-      <w:proofErr w:type="spellEnd"/>
-      <w:r>
-        <w:t xml:space="preserve"> is required as a search node can be referenced by </w:t>
+      <w:r>
+        <w:t xml:space="preserve">std::shared_ptr is required as a search node can be referenced by </w:t>
       </w:r>
       <w:r>
         <w:t>several parts of the search process.</w:t>
@@ -8052,15 +7788,7 @@
         <w:t xml:space="preserve">Manhattan distance only. During consultation with AI while the tool was being built, </w:t>
       </w:r>
       <w:r>
-        <w:t xml:space="preserve">I came across Manhattan-linear conflict. I learnt that this heuristic is </w:t>
-      </w:r>
-      <w:proofErr w:type="gramStart"/>
-      <w:r>
-        <w:t>actually more</w:t>
-      </w:r>
-      <w:proofErr w:type="gramEnd"/>
-      <w:r>
-        <w:t xml:space="preserve"> effective than regular Manhattan distance</w:t>
+        <w:t>I came across Manhattan-linear conflict. I learnt that this heuristic is actually more effective than regular Manhattan distance</w:t>
       </w:r>
       <w:r>
         <w:t xml:space="preserve"> due to the incorrect assumption</w:t>
@@ -8332,13 +8060,8 @@
       <w:r>
         <w:t xml:space="preserve">I was originally unaware that is possibility existed and adjusted my plan. Correctness was not an issue as it was a </w:t>
       </w:r>
-      <w:proofErr w:type="gramStart"/>
-      <w:r>
-        <w:t>fairly shallow</w:t>
-      </w:r>
-      <w:proofErr w:type="gramEnd"/>
-      <w:r>
-        <w:t xml:space="preserve"> context level prompt. </w:t>
+      <w:r>
+        <w:t xml:space="preserve">fairly shallow context level prompt. </w:t>
       </w:r>
       <w:r>
         <w:t xml:space="preserve">It also </w:t>
@@ -8543,15 +8266,7 @@
         <w:t xml:space="preserve">incorrect lines in the generated output. </w:t>
       </w:r>
       <w:r>
-        <w:t>ChatGPT had used “</w:t>
-      </w:r>
-      <w:proofErr w:type="spellStart"/>
-      <w:r>
-        <w:t>shared_ptr</w:t>
-      </w:r>
-      <w:proofErr w:type="spellEnd"/>
-      <w:r>
-        <w:t xml:space="preserve">” </w:t>
+        <w:t xml:space="preserve">ChatGPT had used “shared_ptr” </w:t>
       </w:r>
       <w:r>
         <w:t xml:space="preserve">without </w:t>
@@ -8574,15 +8289,7 @@
     </w:p>
     <w:p>
       <w:r>
-        <w:t xml:space="preserve">The inclusion of the solvability check was very unclear as to what it was </w:t>
-      </w:r>
-      <w:proofErr w:type="gramStart"/>
-      <w:r>
-        <w:t>actually doing</w:t>
-      </w:r>
-      <w:proofErr w:type="gramEnd"/>
-      <w:r>
-        <w:t>,</w:t>
+        <w:t>The inclusion of the solvability check was very unclear as to what it was actually doing,</w:t>
       </w:r>
       <w:r>
         <w:t xml:space="preserve"> as there was no explanation as to how it works.</w:t>
@@ -8677,13 +8384,8 @@
         </w:rPr>
         <w:t xml:space="preserve">What I accepted: </w:t>
       </w:r>
-      <w:proofErr w:type="gramStart"/>
-      <w:r>
-        <w:t>All of</w:t>
-      </w:r>
-      <w:proofErr w:type="gramEnd"/>
-      <w:r>
-        <w:t xml:space="preserve"> this reasoning.</w:t>
+      <w:r>
+        <w:t>All of this reasoning.</w:t>
       </w:r>
       <w:r>
         <w:t xml:space="preserve"> </w:t>
@@ -8745,10 +8447,7 @@
         <w:t xml:space="preserve">Date: </w:t>
       </w:r>
       <w:r>
-        <w:t>2</w:t>
-      </w:r>
-      <w:r>
-        <w:t>1</w:t>
+        <w:t>21</w:t>
       </w:r>
       <w:r>
         <w:t>/9</w:t>
@@ -8764,10 +8463,7 @@
         <w:t xml:space="preserve">Tool: </w:t>
       </w:r>
       <w:r>
-        <w:t>C</w:t>
-      </w:r>
-      <w:r>
-        <w:t>laude</w:t>
+        <w:t>Claude</w:t>
       </w:r>
     </w:p>
     <w:p>
@@ -8935,10 +8631,7 @@
         </m:d>
       </m:oMath>
       <w:r>
-        <w:t xml:space="preserve"> pairwise comparison, which when later</w:t>
-      </w:r>
-      <w:r>
-        <w:t xml:space="preserve"> asked, it </w:t>
+        <w:t xml:space="preserve"> pairwise comparison, which when later asked, it </w:t>
       </w:r>
       <w:r>
         <w:t>gave a reasonable justification of how the run time is fixed to the size of the board (4x4).</w:t>
@@ -9293,6 +8986,172 @@
     </w:p>
     <w:p/>
     <w:p>
+      <w:r>
+        <w:rPr>
+          <w:b/>
+          <w:bCs/>
+        </w:rPr>
+        <w:t xml:space="preserve">Date: </w:t>
+      </w:r>
+      <w:r>
+        <w:t>2</w:t>
+      </w:r>
+      <w:r>
+        <w:t>6</w:t>
+      </w:r>
+      <w:r>
+        <w:t>/9</w:t>
+      </w:r>
+    </w:p>
+    <w:p/>
+    <w:p>
+      <w:r>
+        <w:rPr>
+          <w:b/>
+          <w:bCs/>
+        </w:rPr>
+        <w:t xml:space="preserve">Tool: </w:t>
+      </w:r>
+      <w:r>
+        <w:t>ChatGPT</w:t>
+      </w:r>
+    </w:p>
+    <w:p>
+      <w:pPr>
+        <w:rPr>
+          <w:b/>
+          <w:bCs/>
+        </w:rPr>
+      </w:pPr>
+    </w:p>
+    <w:p>
+      <w:r>
+        <w:rPr>
+          <w:b/>
+          <w:bCs/>
+        </w:rPr>
+        <w:t xml:space="preserve">What I asked: </w:t>
+      </w:r>
+      <w:r>
+        <w:t xml:space="preserve">Generate a </w:t>
+      </w:r>
+      <w:r>
+        <w:t>readme file for the project</w:t>
+      </w:r>
+      <w:r>
+        <w:t>.</w:t>
+      </w:r>
+    </w:p>
+    <w:p>
+      <w:pPr>
+        <w:rPr>
+          <w:b/>
+          <w:bCs/>
+        </w:rPr>
+      </w:pPr>
+    </w:p>
+    <w:p>
+      <w:r>
+        <w:rPr>
+          <w:b/>
+          <w:bCs/>
+        </w:rPr>
+        <w:t xml:space="preserve">What it suggested: </w:t>
+      </w:r>
+      <w:r>
+        <w:t xml:space="preserve">A </w:t>
+      </w:r>
+      <w:r>
+        <w:t>comprehensive readme file</w:t>
+      </w:r>
+      <w:r>
+        <w:t>.</w:t>
+      </w:r>
+    </w:p>
+    <w:p>
+      <w:pPr>
+        <w:rPr>
+          <w:b/>
+          <w:bCs/>
+        </w:rPr>
+      </w:pPr>
+    </w:p>
+    <w:p>
+      <w:r>
+        <w:rPr>
+          <w:b/>
+          <w:bCs/>
+        </w:rPr>
+        <w:t xml:space="preserve">What I accepted: </w:t>
+      </w:r>
+      <w:r>
+        <w:t>Most of the file contents.</w:t>
+      </w:r>
+      <w:r>
+        <w:tab/>
+      </w:r>
+      <w:r>
+        <w:tab/>
+      </w:r>
+    </w:p>
+    <w:p>
+      <w:pPr>
+        <w:rPr>
+          <w:b/>
+          <w:bCs/>
+        </w:rPr>
+      </w:pPr>
+    </w:p>
+    <w:p>
+      <w:r>
+        <w:rPr>
+          <w:b/>
+          <w:bCs/>
+        </w:rPr>
+        <w:t xml:space="preserve">What I checked: </w:t>
+      </w:r>
+      <w:r>
+        <w:t>Read through the whole file to make sure it was correct</w:t>
+      </w:r>
+      <w:r>
+        <w:t>.</w:t>
+      </w:r>
+    </w:p>
+    <w:p>
+      <w:pPr>
+        <w:rPr>
+          <w:b/>
+          <w:bCs/>
+        </w:rPr>
+      </w:pPr>
+    </w:p>
+    <w:p>
+      <w:r>
+        <w:rPr>
+          <w:b/>
+          <w:bCs/>
+        </w:rPr>
+        <w:t xml:space="preserve">What was wrong/useful: </w:t>
+      </w:r>
+      <w:r>
+        <w:t xml:space="preserve">Readme was mostly correct, with some file hierarchy errors and </w:t>
+      </w:r>
+      <w:r>
+        <w:t>a complete omission of Manhattan-linear conflict in the Heuristic section of the file</w:t>
+      </w:r>
+      <w:r>
+        <w:t>.</w:t>
+      </w:r>
+      <w:r>
+        <w:t xml:space="preserve"> Omission was likely due to context window getting </w:t>
+      </w:r>
+      <w:r>
+        <w:t>too wide and memory being strained.</w:t>
+      </w:r>
+    </w:p>
+    <w:p/>
+    <w:p/>
+    <w:p>
       <w:pPr>
         <w:pStyle w:val="Heading2"/>
       </w:pPr>
@@ -9353,18 +9212,13 @@
         <w:t xml:space="preserve">. </w:t>
       </w:r>
       <w:r>
-        <w:t xml:space="preserve">2 specific examples of misleading/incorrect output (mentioned in the AI log) were the incorrect API calling for </w:t>
-      </w:r>
-      <w:proofErr w:type="spellStart"/>
-      <w:r>
-        <w:t>shared_ptr</w:t>
-      </w:r>
-      <w:proofErr w:type="spellEnd"/>
-      <w:r>
-        <w:t xml:space="preserve"> and a complete lack of justification for </w:t>
+        <w:t xml:space="preserve">2 specific examples of misleading/incorrect output (mentioned in the AI log) were the incorrect API calling for shared_ptr and a complete lack of justification for </w:t>
       </w:r>
       <w:r>
         <w:t xml:space="preserve">why Manhattan distance was originally chosen over Manhattan-linear conflict for the original implementation output. </w:t>
+      </w:r>
+      <w:r>
+        <w:t>Other errors include the generation of the readme file and a lack of explanation of the solvability check.</w:t>
       </w:r>
     </w:p>
     <w:sectPr>
@@ -9688,25 +9542,7 @@
             <w:sz w:val="16"/>
             <w:szCs w:val="12"/>
           </w:rPr>
-          <w:t>2</w:t>
-        </w:r>
-        <w:r>
-          <w:rPr>
-            <w:rFonts w:ascii="Arial" w:hAnsi="Arial" w:cs="Arial"/>
-            <w:noProof/>
-            <w:sz w:val="16"/>
-            <w:szCs w:val="12"/>
-          </w:rPr>
-          <w:t>7</w:t>
-        </w:r>
-        <w:r>
-          <w:rPr>
-            <w:rFonts w:ascii="Arial" w:hAnsi="Arial" w:cs="Arial"/>
-            <w:noProof/>
-            <w:sz w:val="16"/>
-            <w:szCs w:val="12"/>
-          </w:rPr>
-          <w:t>/09/2026</w:t>
+          <w:t>26/09/2026</w:t>
         </w:r>
         <w:r>
           <w:rPr>
@@ -15158,6 +14994,7 @@
   <w:style w:type="character" w:default="1" w:styleId="DefaultParagraphFont">
     <w:name w:val="Default Paragraph Font"/>
     <w:uiPriority w:val="1"/>
+    <w:semiHidden/>
     <w:unhideWhenUsed/>
   </w:style>
   <w:style w:type="table" w:default="1" w:styleId="TableNormal">
@@ -15889,10 +15726,6 @@
 </file>
 
 <file path=customXml/item1.xml><?xml version="1.0" encoding="utf-8"?>
-<b:Sources xmlns:b="http://schemas.openxmlformats.org/officeDocument/2006/bibliography" xmlns="http://schemas.openxmlformats.org/officeDocument/2006/bibliography" SelectedStyle="\APASixthEditionOfficeOnline.xsl" StyleName="APA" Version="6"/>
-</file>
-
-<file path=customXml/item2.xml><?xml version="1.0" encoding="utf-8"?>
 <p:properties xmlns:p="http://schemas.microsoft.com/office/2006/metadata/properties" xmlns:xsi="http://www.w3.org/2001/XMLSchema-instance" xmlns:pc="http://schemas.microsoft.com/office/infopath/2007/PartnerControls">
   <documentManagement>
     <KeyDocument xmlns="599cdadb-518c-4a4c-85ba-dbf7adc631b4">No</KeyDocument>
@@ -15905,7 +15738,20 @@
 </p:properties>
 </file>
 
+<file path=customXml/item2.xml><?xml version="1.0" encoding="utf-8"?>
+<b:Sources xmlns:b="http://schemas.openxmlformats.org/officeDocument/2006/bibliography" xmlns="http://schemas.openxmlformats.org/officeDocument/2006/bibliography" SelectedStyle="\APASixthEditionOfficeOnline.xsl" StyleName="APA" Version="6"/>
+</file>
+
 <file path=customXml/item3.xml><?xml version="1.0" encoding="utf-8"?>
+<?mso-contentType ?>
+<FormTemplates xmlns="http://schemas.microsoft.com/sharepoint/v3/contenttype/forms">
+  <Display>DocumentLibraryForm</Display>
+  <Edit>DocumentLibraryForm</Edit>
+  <New>DocumentLibraryForm</New>
+</FormTemplates>
+</file>
+
+<file path=customXml/item4.xml><?xml version="1.0" encoding="utf-8"?>
 <ct:contentTypeSchema xmlns:ct="http://schemas.microsoft.com/office/2006/metadata/contentType" xmlns:ma="http://schemas.microsoft.com/office/2006/metadata/properties/metaAttributes" ct:_="" ma:_="" ma:contentTypeName="Document" ma:contentTypeID="0x010100D07A8468A96921419EC8CB9BF791CD1B" ma:contentTypeVersion="3" ma:contentTypeDescription="Create a new document." ma:contentTypeScope="" ma:versionID="8e09059436c6d1085ff2e74b3772b035">
   <xsd:schema xmlns:xsd="http://www.w3.org/2001/XMLSchema" xmlns:xs="http://www.w3.org/2001/XMLSchema" xmlns:p="http://schemas.microsoft.com/office/2006/metadata/properties" xmlns:ns1="http://schemas.microsoft.com/sharepoint/v3" xmlns:ns2="eed576b4-51ef-4fde-88aa-d1998b7e86ab" xmlns:ns3="420b5d22-3341-4f60-b4d6-57d88f13fbf6" xmlns:ns4="599cdadb-518c-4a4c-85ba-dbf7adc631b4" targetNamespace="http://schemas.microsoft.com/office/2006/metadata/properties" ma:root="true" ma:fieldsID="ed8dc5b1fb6572d465f2cc67d2746df9" ns1:_="" ns2:_="" ns3:_="" ns4:_="">
     <xsd:import namespace="http://schemas.microsoft.com/sharepoint/v3"/>
@@ -16111,24 +15957,7 @@
 </ct:contentTypeSchema>
 </file>
 
-<file path=customXml/item4.xml><?xml version="1.0" encoding="utf-8"?>
-<?mso-contentType ?>
-<FormTemplates xmlns="http://schemas.microsoft.com/sharepoint/v3/contenttype/forms">
-  <Display>DocumentLibraryForm</Display>
-  <Edit>DocumentLibraryForm</Edit>
-  <New>DocumentLibraryForm</New>
-</FormTemplates>
-</file>
-
 <file path=customXml/itemProps1.xml><?xml version="1.0" encoding="utf-8"?>
-<ds:datastoreItem xmlns:ds="http://schemas.openxmlformats.org/officeDocument/2006/customXml" ds:itemID="{406414B0-3F0B-479C-8EA2-FDEDCB93AF27}">
-  <ds:schemaRefs>
-    <ds:schemaRef ds:uri="http://schemas.openxmlformats.org/officeDocument/2006/bibliography"/>
-  </ds:schemaRefs>
-</ds:datastoreItem>
-</file>
-
-<file path=customXml/itemProps2.xml><?xml version="1.0" encoding="utf-8"?>
 <ds:datastoreItem xmlns:ds="http://schemas.openxmlformats.org/officeDocument/2006/customXml" ds:itemID="{7CEB07B8-A871-4052-983A-0EDE95CB2779}">
   <ds:schemaRefs>
     <ds:schemaRef ds:uri="http://schemas.microsoft.com/office/2006/metadata/properties"/>
@@ -16141,7 +15970,23 @@
 </ds:datastoreItem>
 </file>
 
+<file path=customXml/itemProps2.xml><?xml version="1.0" encoding="utf-8"?>
+<ds:datastoreItem xmlns:ds="http://schemas.openxmlformats.org/officeDocument/2006/customXml" ds:itemID="{406414B0-3F0B-479C-8EA2-FDEDCB93AF27}">
+  <ds:schemaRefs>
+    <ds:schemaRef ds:uri="http://schemas.openxmlformats.org/officeDocument/2006/bibliography"/>
+  </ds:schemaRefs>
+</ds:datastoreItem>
+</file>
+
 <file path=customXml/itemProps3.xml><?xml version="1.0" encoding="utf-8"?>
+<ds:datastoreItem xmlns:ds="http://schemas.openxmlformats.org/officeDocument/2006/customXml" ds:itemID="{69B96D5B-8A15-437D-9C1A-88BF09EE8B43}">
+  <ds:schemaRefs>
+    <ds:schemaRef ds:uri="http://schemas.microsoft.com/sharepoint/v3/contenttype/forms"/>
+  </ds:schemaRefs>
+</ds:datastoreItem>
+</file>
+
+<file path=customXml/itemProps4.xml><?xml version="1.0" encoding="utf-8"?>
 <ds:datastoreItem xmlns:ds="http://schemas.openxmlformats.org/officeDocument/2006/customXml" ds:itemID="{C45E8554-5B65-4B20-8BCC-DCBD8919F0EB}">
   <ds:schemaRefs>
     <ds:schemaRef ds:uri="http://schemas.microsoft.com/office/2006/metadata/contentType"/>
@@ -16160,12 +16005,4 @@
     <ds:schemaRef ds:uri="http://schemas.microsoft.com/internal/obd"/>
   </ds:schemaRefs>
 </ds:datastoreItem>
-</file>
-
-<file path=customXml/itemProps4.xml><?xml version="1.0" encoding="utf-8"?>
-<ds:datastoreItem xmlns:ds="http://schemas.openxmlformats.org/officeDocument/2006/customXml" ds:itemID="{69B96D5B-8A15-437D-9C1A-88BF09EE8B43}">
-  <ds:schemaRefs>
-    <ds:schemaRef ds:uri="http://schemas.microsoft.com/sharepoint/v3/contenttype/forms"/>
-  </ds:schemaRefs>
-</ds:datastoreItem>
 </file>
</xml_diff>

<commit_message>
added references to report
</commit_message>
<xml_diff>
--- a/Assignment1Report.docx
+++ b/Assignment1Report.docx
@@ -11,6 +11,7 @@
       </w:pPr>
       <w:bookmarkStart w:id="0" w:name="_Toc238734182"/>
       <w:bookmarkStart w:id="1" w:name="_Toc241314091"/>
+      <w:bookmarkStart w:id="2" w:name="_Toc241689352"/>
       <w:r>
         <w:rPr>
           <w:color w:val="auto"/>
@@ -25,6 +26,7 @@
       </w:r>
       <w:bookmarkEnd w:id="0"/>
       <w:bookmarkEnd w:id="1"/>
+      <w:bookmarkEnd w:id="2"/>
     </w:p>
     <w:p>
       <w:pPr>
@@ -758,16 +760,7 @@
                 <w:szCs w:val="24"/>
                 <w:lang w:val="en-US"/>
               </w:rPr>
-              <w:t>2</w:t>
-            </w:r>
-            <w:r>
-              <w:rPr>
-                <w:rFonts w:ascii="Arial" w:eastAsia="Arial Unicode MS" w:hAnsi="Arial" w:cs="Arial"/>
-                <w:sz w:val="20"/>
-                <w:szCs w:val="24"/>
-                <w:lang w:val="en-US"/>
-              </w:rPr>
-              <w:t>7</w:t>
+              <w:t>30</w:t>
             </w:r>
             <w:r>
               <w:rPr>
@@ -926,9 +919,9 @@
                 <w:szCs w:val="16"/>
               </w:rPr>
             </w:pPr>
-            <w:bookmarkStart w:id="2" w:name="Check1"/>
-          </w:p>
-          <w:bookmarkEnd w:id="2"/>
+            <w:bookmarkStart w:id="3" w:name="Check1"/>
+          </w:p>
+          <w:bookmarkEnd w:id="3"/>
           <w:p>
             <w:pPr>
               <w:spacing w:line="264" w:lineRule="auto"/>
@@ -1144,7 +1137,25 @@
                 <w:sz w:val="16"/>
                 <w:szCs w:val="16"/>
               </w:rPr>
-              <w:t xml:space="preserve"> I understand that if this assignment is submitted after the due date it may incur a penalty for lateness unless I have previously had an extension of time approved and have attached the written confirmation of this extension.</w:t>
+              <w:t xml:space="preserve"> I understand that if this assignment is submitted after the due </w:t>
+            </w:r>
+            <w:proofErr w:type="gramStart"/>
+            <w:r>
+              <w:rPr>
+                <w:rFonts w:ascii="Arial" w:eastAsia="Arial Unicode MS" w:hAnsi="Arial" w:cs="Arial"/>
+                <w:sz w:val="16"/>
+                <w:szCs w:val="16"/>
+              </w:rPr>
+              <w:t>date</w:t>
+            </w:r>
+            <w:proofErr w:type="gramEnd"/>
+            <w:r>
+              <w:rPr>
+                <w:rFonts w:ascii="Arial" w:eastAsia="Arial Unicode MS" w:hAnsi="Arial" w:cs="Arial"/>
+                <w:sz w:val="16"/>
+                <w:szCs w:val="16"/>
+              </w:rPr>
+              <w:t xml:space="preserve"> it may incur a penalty for lateness unless I have previously had an extension of time approved and have attached the written confirmation of this extension.</w:t>
             </w:r>
           </w:p>
           <w:p>
@@ -1208,7 +1219,23 @@
                 <w:rFonts w:ascii="Arial" w:eastAsia="Arial Unicode MS" w:hAnsi="Arial" w:cs="Arial"/>
                 <w:sz w:val="16"/>
               </w:rPr>
-              <w:t>that, should this declaration be found to be false, disciplinary action could be taken and penalties imposed in accordance with University policy and rules. In the statement below, I have indicated the extent to which I have collaborated with others, whom I have named.</w:t>
+              <w:t xml:space="preserve">that, should this declaration be found to be false, disciplinary action could be taken and penalties imposed in accordance with </w:t>
+            </w:r>
+            <w:proofErr w:type="gramStart"/>
+            <w:r>
+              <w:rPr>
+                <w:rFonts w:ascii="Arial" w:eastAsia="Arial Unicode MS" w:hAnsi="Arial" w:cs="Arial"/>
+                <w:sz w:val="16"/>
+              </w:rPr>
+              <w:t>University</w:t>
+            </w:r>
+            <w:proofErr w:type="gramEnd"/>
+            <w:r>
+              <w:rPr>
+                <w:rFonts w:ascii="Arial" w:eastAsia="Arial Unicode MS" w:hAnsi="Arial" w:cs="Arial"/>
+                <w:sz w:val="16"/>
+              </w:rPr>
+              <w:t xml:space="preserve"> policy and rules. In the statement below, I have indicated the extent to which I have collaborated with others, whom I have named.</w:t>
             </w:r>
           </w:p>
           <w:p>
@@ -1819,14 +1846,16 @@
             <w:pPr>
               <w:pStyle w:val="Heading2"/>
             </w:pPr>
-            <w:bookmarkStart w:id="3" w:name="_Toc238734183"/>
-            <w:bookmarkStart w:id="4" w:name="_Toc241314092"/>
+            <w:bookmarkStart w:id="4" w:name="_Toc238734183"/>
+            <w:bookmarkStart w:id="5" w:name="_Toc241314092"/>
+            <w:bookmarkStart w:id="6" w:name="_Toc241689353"/>
             <w:r>
               <w:lastRenderedPageBreak/>
               <w:t>STYLE GUIDE for ASSIGNMENT SUBMISSION</w:t>
             </w:r>
-            <w:bookmarkEnd w:id="3"/>
             <w:bookmarkEnd w:id="4"/>
+            <w:bookmarkEnd w:id="5"/>
+            <w:bookmarkEnd w:id="6"/>
           </w:p>
           <w:p>
             <w:pPr>
@@ -2069,8 +2098,9 @@
                 <w:sz w:val="28"/>
               </w:rPr>
             </w:pPr>
-            <w:bookmarkStart w:id="5" w:name="_Toc238734184"/>
-            <w:bookmarkStart w:id="6" w:name="_Toc241314093"/>
+            <w:bookmarkStart w:id="7" w:name="_Toc238734184"/>
+            <w:bookmarkStart w:id="8" w:name="_Toc241314093"/>
+            <w:bookmarkStart w:id="9" w:name="_Toc241689354"/>
             <w:r>
               <w:t>Writi</w:t>
             </w:r>
@@ -2080,8 +2110,9 @@
             <w:r>
               <w:t>tyle</w:t>
             </w:r>
-            <w:bookmarkEnd w:id="5"/>
-            <w:bookmarkEnd w:id="6"/>
+            <w:bookmarkEnd w:id="7"/>
+            <w:bookmarkEnd w:id="8"/>
+            <w:bookmarkEnd w:id="9"/>
           </w:p>
           <w:p>
             <w:pPr>
@@ -2141,7 +2172,23 @@
                 <w:rFonts w:ascii="Arial" w:hAnsi="Arial" w:cs="Arial"/>
                 <w:sz w:val="20"/>
               </w:rPr>
-              <w:t>: use the correct genre and language style expected for the particular task.</w:t>
+              <w:t xml:space="preserve">: use the correct genre and language style expected for the </w:t>
+            </w:r>
+            <w:proofErr w:type="gramStart"/>
+            <w:r>
+              <w:rPr>
+                <w:rFonts w:ascii="Arial" w:hAnsi="Arial" w:cs="Arial"/>
+                <w:sz w:val="20"/>
+              </w:rPr>
+              <w:t>particular task</w:t>
+            </w:r>
+            <w:proofErr w:type="gramEnd"/>
+            <w:r>
+              <w:rPr>
+                <w:rFonts w:ascii="Arial" w:hAnsi="Arial" w:cs="Arial"/>
+                <w:sz w:val="20"/>
+              </w:rPr>
+              <w:t>.</w:t>
             </w:r>
           </w:p>
           <w:p>
@@ -2310,15 +2357,41 @@
                 <w:rFonts w:ascii="Arial" w:hAnsi="Arial" w:cs="Arial"/>
                 <w:sz w:val="20"/>
               </w:rPr>
-              <w:t xml:space="preserve">ISO (International Organisation for Standardisation) for writing dates and times for international documents. For example </w:t>
-            </w:r>
+              <w:t xml:space="preserve">ISO (International Organisation for Standardisation) for writing dates and times for international documents. For </w:t>
+            </w:r>
+            <w:proofErr w:type="gramStart"/>
+            <w:r>
+              <w:rPr>
+                <w:rFonts w:ascii="Arial" w:hAnsi="Arial" w:cs="Arial"/>
+                <w:sz w:val="20"/>
+              </w:rPr>
+              <w:t>example</w:t>
+            </w:r>
+            <w:proofErr w:type="gramEnd"/>
+            <w:r>
+              <w:rPr>
+                <w:rFonts w:ascii="Arial" w:hAnsi="Arial" w:cs="Arial"/>
+                <w:sz w:val="20"/>
+              </w:rPr>
+              <w:t xml:space="preserve"> </w:t>
+            </w:r>
+            <w:proofErr w:type="spellStart"/>
             <w:r>
               <w:rPr>
                 <w:rFonts w:ascii="Arial" w:hAnsi="Arial" w:cs="Arial"/>
                 <w:b/>
                 <w:sz w:val="20"/>
               </w:rPr>
-              <w:t xml:space="preserve">yyyy-mm-dd </w:t>
+              <w:t>yyyy</w:t>
+            </w:r>
+            <w:proofErr w:type="spellEnd"/>
+            <w:r>
+              <w:rPr>
+                <w:rFonts w:ascii="Arial" w:hAnsi="Arial" w:cs="Arial"/>
+                <w:b/>
+                <w:sz w:val="20"/>
+              </w:rPr>
+              <w:t xml:space="preserve">-mm-dd </w:t>
             </w:r>
             <w:r>
               <w:rPr>
@@ -2327,13 +2400,23 @@
               </w:rPr>
               <w:t xml:space="preserve">or </w:t>
             </w:r>
+            <w:proofErr w:type="spellStart"/>
             <w:r>
               <w:rPr>
                 <w:rFonts w:ascii="Arial" w:hAnsi="Arial" w:cs="Arial"/>
                 <w:b/>
                 <w:sz w:val="20"/>
               </w:rPr>
-              <w:t>hh-mm-ss</w:t>
+              <w:t>hh</w:t>
+            </w:r>
+            <w:proofErr w:type="spellEnd"/>
+            <w:r>
+              <w:rPr>
+                <w:rFonts w:ascii="Arial" w:hAnsi="Arial" w:cs="Arial"/>
+                <w:b/>
+                <w:sz w:val="20"/>
+              </w:rPr>
+              <w:t>-mm-ss</w:t>
             </w:r>
             <w:r>
               <w:rPr>
@@ -2509,13 +2592,15 @@
                 <w:sz w:val="28"/>
               </w:rPr>
             </w:pPr>
-            <w:bookmarkStart w:id="7" w:name="_Toc238734185"/>
-            <w:bookmarkStart w:id="8" w:name="_Toc241314094"/>
+            <w:bookmarkStart w:id="10" w:name="_Toc238734185"/>
+            <w:bookmarkStart w:id="11" w:name="_Toc241314094"/>
+            <w:bookmarkStart w:id="12" w:name="_Toc241689355"/>
             <w:r>
               <w:t>Presentation</w:t>
             </w:r>
-            <w:bookmarkEnd w:id="7"/>
-            <w:bookmarkEnd w:id="8"/>
+            <w:bookmarkEnd w:id="10"/>
+            <w:bookmarkEnd w:id="11"/>
+            <w:bookmarkEnd w:id="12"/>
           </w:p>
           <w:p>
             <w:pPr>
@@ -2941,13 +3026,15 @@
                 <w:sz w:val="28"/>
               </w:rPr>
             </w:pPr>
-            <w:bookmarkStart w:id="9" w:name="_Toc238734186"/>
-            <w:bookmarkStart w:id="10" w:name="_Toc241314095"/>
+            <w:bookmarkStart w:id="13" w:name="_Toc238734186"/>
+            <w:bookmarkStart w:id="14" w:name="_Toc241314095"/>
+            <w:bookmarkStart w:id="15" w:name="_Toc241689356"/>
             <w:r>
               <w:t>Referencing</w:t>
             </w:r>
-            <w:bookmarkEnd w:id="9"/>
-            <w:bookmarkEnd w:id="10"/>
+            <w:bookmarkEnd w:id="13"/>
+            <w:bookmarkEnd w:id="14"/>
+            <w:bookmarkEnd w:id="15"/>
           </w:p>
           <w:p>
             <w:pPr>
@@ -3197,8 +3284,9 @@
       <w:pPr>
         <w:pStyle w:val="Heading1"/>
       </w:pPr>
-      <w:bookmarkStart w:id="11" w:name="_Toc238734187"/>
-      <w:bookmarkStart w:id="12" w:name="_Toc241314096"/>
+      <w:bookmarkStart w:id="16" w:name="_Toc238734187"/>
+      <w:bookmarkStart w:id="17" w:name="_Toc241314096"/>
+      <w:bookmarkStart w:id="18" w:name="_Toc241689357"/>
       <w:r>
         <w:t xml:space="preserve">Report </w:t>
       </w:r>
@@ -3208,14 +3296,15 @@
       <w:r>
         <w:t xml:space="preserve"> </w:t>
       </w:r>
-      <w:bookmarkEnd w:id="11"/>
+      <w:bookmarkEnd w:id="16"/>
       <w:r>
         <w:t xml:space="preserve">A* </w:t>
       </w:r>
       <w:r>
         <w:t>Algorithm</w:t>
       </w:r>
-      <w:bookmarkEnd w:id="12"/>
+      <w:bookmarkEnd w:id="17"/>
+      <w:bookmarkEnd w:id="18"/>
     </w:p>
     <w:p>
       <w:pPr>
@@ -3391,13 +3480,15 @@
       <w:pPr>
         <w:pStyle w:val="Heading1"/>
       </w:pPr>
-      <w:bookmarkStart w:id="13" w:name="_Toc238734188"/>
-      <w:bookmarkStart w:id="14" w:name="_Toc241314097"/>
+      <w:bookmarkStart w:id="19" w:name="_Toc238734188"/>
+      <w:bookmarkStart w:id="20" w:name="_Toc241314097"/>
+      <w:bookmarkStart w:id="21" w:name="_Toc241689358"/>
       <w:r>
         <w:t>Table of Contents</w:t>
       </w:r>
-      <w:bookmarkEnd w:id="13"/>
-      <w:bookmarkEnd w:id="14"/>
+      <w:bookmarkEnd w:id="19"/>
+      <w:bookmarkEnd w:id="20"/>
+      <w:bookmarkEnd w:id="21"/>
     </w:p>
     <w:p/>
     <w:sdt>
@@ -3471,7 +3562,7 @@
               <w14:ligatures w14:val="standardContextual"/>
             </w:rPr>
           </w:pPr>
-          <w:hyperlink w:anchor="_Toc241314098" w:history="1">
+          <w:hyperlink w:anchor="_Toc241689359" w:history="1">
             <w:r>
               <w:rPr>
                 <w:rStyle w:val="Hyperlink"/>
@@ -3498,7 +3589,7 @@
                 <w:noProof/>
                 <w:webHidden/>
               </w:rPr>
-              <w:instrText xml:space="preserve"> PAGEREF _Toc241314098 \h </w:instrText>
+              <w:instrText xml:space="preserve"> PAGEREF _Toc241689359 \h </w:instrText>
             </w:r>
             <w:r>
               <w:rPr>
@@ -3544,7 +3635,7 @@
               <w14:ligatures w14:val="standardContextual"/>
             </w:rPr>
           </w:pPr>
-          <w:hyperlink w:anchor="_Toc241314099" w:history="1">
+          <w:hyperlink w:anchor="_Toc241689360" w:history="1">
             <w:r>
               <w:rPr>
                 <w:rStyle w:val="Hyperlink"/>
@@ -3571,7 +3662,7 @@
                 <w:noProof/>
                 <w:webHidden/>
               </w:rPr>
-              <w:instrText xml:space="preserve"> PAGEREF _Toc241314099 \h </w:instrText>
+              <w:instrText xml:space="preserve"> PAGEREF _Toc241689360 \h </w:instrText>
             </w:r>
             <w:r>
               <w:rPr>
@@ -3617,7 +3708,7 @@
               <w14:ligatures w14:val="standardContextual"/>
             </w:rPr>
           </w:pPr>
-          <w:hyperlink w:anchor="_Toc241314100" w:history="1">
+          <w:hyperlink w:anchor="_Toc241689361" w:history="1">
             <w:r>
               <w:rPr>
                 <w:rStyle w:val="Hyperlink"/>
@@ -3644,7 +3735,7 @@
                 <w:noProof/>
                 <w:webHidden/>
               </w:rPr>
-              <w:instrText xml:space="preserve"> PAGEREF _Toc241314100 \h </w:instrText>
+              <w:instrText xml:space="preserve"> PAGEREF _Toc241689361 \h </w:instrText>
             </w:r>
             <w:r>
               <w:rPr>
@@ -3682,10 +3773,15 @@
               <w:tab w:val="right" w:leader="dot" w:pos="10449"/>
             </w:tabs>
             <w:rPr>
+              <w:rFonts w:asciiTheme="minorHAnsi" w:eastAsiaTheme="minorEastAsia" w:hAnsiTheme="minorHAnsi" w:cstheme="minorBidi"/>
               <w:noProof/>
+              <w:kern w:val="2"/>
+              <w:szCs w:val="24"/>
+              <w:lang w:eastAsia="en-AU"/>
+              <w14:ligatures w14:val="standardContextual"/>
             </w:rPr>
           </w:pPr>
-          <w:hyperlink w:anchor="_Toc241314101" w:history="1">
+          <w:hyperlink w:anchor="_Toc241689362" w:history="1">
             <w:r>
               <w:rPr>
                 <w:rStyle w:val="Hyperlink"/>
@@ -3712,7 +3808,7 @@
                 <w:noProof/>
                 <w:webHidden/>
               </w:rPr>
-              <w:instrText xml:space="preserve"> PAGEREF _Toc241314101 \h </w:instrText>
+              <w:instrText xml:space="preserve"> PAGEREF _Toc241689362 \h </w:instrText>
             </w:r>
             <w:r>
               <w:rPr>
@@ -3750,10 +3846,15 @@
               <w:tab w:val="right" w:leader="dot" w:pos="10449"/>
             </w:tabs>
             <w:rPr>
+              <w:rFonts w:asciiTheme="minorHAnsi" w:eastAsiaTheme="minorEastAsia" w:hAnsiTheme="minorHAnsi" w:cstheme="minorBidi"/>
               <w:noProof/>
+              <w:kern w:val="2"/>
+              <w:szCs w:val="24"/>
+              <w:lang w:eastAsia="en-AU"/>
+              <w14:ligatures w14:val="standardContextual"/>
             </w:rPr>
           </w:pPr>
-          <w:hyperlink w:anchor="_Toc241314102" w:history="1">
+          <w:hyperlink w:anchor="_Toc241689363" w:history="1">
             <w:r>
               <w:rPr>
                 <w:rStyle w:val="Hyperlink"/>
@@ -3780,7 +3881,7 @@
                 <w:noProof/>
                 <w:webHidden/>
               </w:rPr>
-              <w:instrText xml:space="preserve"> PAGEREF _Toc241314102 \h </w:instrText>
+              <w:instrText xml:space="preserve"> PAGEREF _Toc241689363 \h </w:instrText>
             </w:r>
             <w:r>
               <w:rPr>
@@ -3818,10 +3919,15 @@
               <w:tab w:val="right" w:leader="dot" w:pos="10449"/>
             </w:tabs>
             <w:rPr>
+              <w:rFonts w:asciiTheme="minorHAnsi" w:eastAsiaTheme="minorEastAsia" w:hAnsiTheme="minorHAnsi" w:cstheme="minorBidi"/>
               <w:noProof/>
+              <w:kern w:val="2"/>
+              <w:szCs w:val="24"/>
+              <w:lang w:eastAsia="en-AU"/>
+              <w14:ligatures w14:val="standardContextual"/>
             </w:rPr>
           </w:pPr>
-          <w:hyperlink w:anchor="_Toc241314103" w:history="1">
+          <w:hyperlink w:anchor="_Toc241689364" w:history="1">
             <w:r>
               <w:rPr>
                 <w:rStyle w:val="Hyperlink"/>
@@ -3848,7 +3954,7 @@
                 <w:noProof/>
                 <w:webHidden/>
               </w:rPr>
-              <w:instrText xml:space="preserve"> PAGEREF _Toc241314103 \h </w:instrText>
+              <w:instrText xml:space="preserve"> PAGEREF _Toc241689364 \h </w:instrText>
             </w:r>
             <w:r>
               <w:rPr>
@@ -3894,7 +4000,7 @@
               <w14:ligatures w14:val="standardContextual"/>
             </w:rPr>
           </w:pPr>
-          <w:hyperlink w:anchor="_Toc241314104" w:history="1">
+          <w:hyperlink w:anchor="_Toc241689365" w:history="1">
             <w:r>
               <w:rPr>
                 <w:rStyle w:val="Hyperlink"/>
@@ -3921,7 +4027,7 @@
                 <w:noProof/>
                 <w:webHidden/>
               </w:rPr>
-              <w:instrText xml:space="preserve"> PAGEREF _Toc241314104 \h </w:instrText>
+              <w:instrText xml:space="preserve"> PAGEREF _Toc241689365 \h </w:instrText>
             </w:r>
             <w:r>
               <w:rPr>
@@ -3967,7 +4073,7 @@
               <w14:ligatures w14:val="standardContextual"/>
             </w:rPr>
           </w:pPr>
-          <w:hyperlink w:anchor="_Toc241314105" w:history="1">
+          <w:hyperlink w:anchor="_Toc241689366" w:history="1">
             <w:r>
               <w:rPr>
                 <w:rStyle w:val="Hyperlink"/>
@@ -3994,7 +4100,7 @@
                 <w:noProof/>
                 <w:webHidden/>
               </w:rPr>
-              <w:instrText xml:space="preserve"> PAGEREF _Toc241314105 \h </w:instrText>
+              <w:instrText xml:space="preserve"> PAGEREF _Toc241689366 \h </w:instrText>
             </w:r>
             <w:r>
               <w:rPr>
@@ -4040,7 +4146,7 @@
               <w14:ligatures w14:val="standardContextual"/>
             </w:rPr>
           </w:pPr>
-          <w:hyperlink w:anchor="_Toc241314106" w:history="1">
+          <w:hyperlink w:anchor="_Toc241689367" w:history="1">
             <w:r>
               <w:rPr>
                 <w:rStyle w:val="Hyperlink"/>
@@ -4067,7 +4173,7 @@
                 <w:noProof/>
                 <w:webHidden/>
               </w:rPr>
-              <w:instrText xml:space="preserve"> PAGEREF _Toc241314106 \h </w:instrText>
+              <w:instrText xml:space="preserve"> PAGEREF _Toc241689367 \h </w:instrText>
             </w:r>
             <w:r>
               <w:rPr>
@@ -4113,7 +4219,7 @@
               <w14:ligatures w14:val="standardContextual"/>
             </w:rPr>
           </w:pPr>
-          <w:hyperlink w:anchor="_Toc241314107" w:history="1">
+          <w:hyperlink w:anchor="_Toc241689368" w:history="1">
             <w:r>
               <w:rPr>
                 <w:rStyle w:val="Hyperlink"/>
@@ -4140,7 +4246,7 @@
                 <w:noProof/>
                 <w:webHidden/>
               </w:rPr>
-              <w:instrText xml:space="preserve"> PAGEREF _Toc241314107 \h </w:instrText>
+              <w:instrText xml:space="preserve"> PAGEREF _Toc241689368 \h </w:instrText>
             </w:r>
             <w:r>
               <w:rPr>
@@ -4160,7 +4266,7 @@
                 <w:noProof/>
                 <w:webHidden/>
               </w:rPr>
-              <w:t>9</w:t>
+              <w:t>8</w:t>
             </w:r>
             <w:r>
               <w:rPr>
@@ -4186,7 +4292,7 @@
               <w14:ligatures w14:val="standardContextual"/>
             </w:rPr>
           </w:pPr>
-          <w:hyperlink w:anchor="_Toc241314112" w:history="1">
+          <w:hyperlink w:anchor="_Toc241689373" w:history="1">
             <w:r>
               <w:rPr>
                 <w:rStyle w:val="Hyperlink"/>
@@ -4213,7 +4319,7 @@
                 <w:noProof/>
                 <w:webHidden/>
               </w:rPr>
-              <w:instrText xml:space="preserve"> PAGEREF _Toc241314112 \h </w:instrText>
+              <w:instrText xml:space="preserve"> PAGEREF _Toc241689373 \h </w:instrText>
             </w:r>
             <w:r>
               <w:rPr>
@@ -4259,7 +4365,7 @@
               <w14:ligatures w14:val="standardContextual"/>
             </w:rPr>
           </w:pPr>
-          <w:hyperlink w:anchor="_Toc241314113" w:history="1">
+          <w:hyperlink w:anchor="_Toc241689374" w:history="1">
             <w:r>
               <w:rPr>
                 <w:rStyle w:val="Hyperlink"/>
@@ -4286,7 +4392,7 @@
                 <w:noProof/>
                 <w:webHidden/>
               </w:rPr>
-              <w:instrText xml:space="preserve"> PAGEREF _Toc241314113 \h </w:instrText>
+              <w:instrText xml:space="preserve"> PAGEREF _Toc241689374 \h </w:instrText>
             </w:r>
             <w:r>
               <w:rPr>
@@ -4332,7 +4438,7 @@
               <w14:ligatures w14:val="standardContextual"/>
             </w:rPr>
           </w:pPr>
-          <w:hyperlink w:anchor="_Toc241314114" w:history="1">
+          <w:hyperlink w:anchor="_Toc241689375" w:history="1">
             <w:r>
               <w:rPr>
                 <w:rStyle w:val="Hyperlink"/>
@@ -4359,7 +4465,7 @@
                 <w:noProof/>
                 <w:webHidden/>
               </w:rPr>
-              <w:instrText xml:space="preserve"> PAGEREF _Toc241314114 \h </w:instrText>
+              <w:instrText xml:space="preserve"> PAGEREF _Toc241689375 \h </w:instrText>
             </w:r>
             <w:r>
               <w:rPr>
@@ -4405,7 +4511,7 @@
               <w14:ligatures w14:val="standardContextual"/>
             </w:rPr>
           </w:pPr>
-          <w:hyperlink w:anchor="_Toc241314115" w:history="1">
+          <w:hyperlink w:anchor="_Toc241689376" w:history="1">
             <w:r>
               <w:rPr>
                 <w:rStyle w:val="Hyperlink"/>
@@ -4432,7 +4538,7 @@
                 <w:noProof/>
                 <w:webHidden/>
               </w:rPr>
-              <w:instrText xml:space="preserve"> PAGEREF _Toc241314115 \h </w:instrText>
+              <w:instrText xml:space="preserve"> PAGEREF _Toc241689376 \h </w:instrText>
             </w:r>
             <w:r>
               <w:rPr>
@@ -4478,7 +4584,7 @@
               <w14:ligatures w14:val="standardContextual"/>
             </w:rPr>
           </w:pPr>
-          <w:hyperlink w:anchor="_Toc241314116" w:history="1">
+          <w:hyperlink w:anchor="_Toc241689377" w:history="1">
             <w:r>
               <w:rPr>
                 <w:rStyle w:val="Hyperlink"/>
@@ -4505,7 +4611,7 @@
                 <w:noProof/>
                 <w:webHidden/>
               </w:rPr>
-              <w:instrText xml:space="preserve"> PAGEREF _Toc241314116 \h </w:instrText>
+              <w:instrText xml:space="preserve"> PAGEREF _Toc241689377 \h </w:instrText>
             </w:r>
             <w:r>
               <w:rPr>
@@ -4525,7 +4631,80 @@
                 <w:noProof/>
                 <w:webHidden/>
               </w:rPr>
-              <w:t>14</w:t>
+              <w:t>15</w:t>
+            </w:r>
+            <w:r>
+              <w:rPr>
+                <w:noProof/>
+                <w:webHidden/>
+              </w:rPr>
+              <w:fldChar w:fldCharType="end"/>
+            </w:r>
+          </w:hyperlink>
+        </w:p>
+        <w:p>
+          <w:pPr>
+            <w:pStyle w:val="TOC1"/>
+            <w:tabs>
+              <w:tab w:val="right" w:leader="dot" w:pos="10449"/>
+            </w:tabs>
+            <w:rPr>
+              <w:rFonts w:asciiTheme="minorHAnsi" w:eastAsiaTheme="minorEastAsia" w:hAnsiTheme="minorHAnsi" w:cstheme="minorBidi"/>
+              <w:noProof/>
+              <w:kern w:val="2"/>
+              <w:szCs w:val="24"/>
+              <w:lang w:eastAsia="en-AU"/>
+              <w14:ligatures w14:val="standardContextual"/>
+            </w:rPr>
+          </w:pPr>
+          <w:hyperlink w:anchor="_Toc241689378" w:history="1">
+            <w:r>
+              <w:rPr>
+                <w:rStyle w:val="Hyperlink"/>
+                <w:noProof/>
+              </w:rPr>
+              <w:t>References</w:t>
+            </w:r>
+            <w:r>
+              <w:rPr>
+                <w:noProof/>
+                <w:webHidden/>
+              </w:rPr>
+              <w:tab/>
+            </w:r>
+            <w:r>
+              <w:rPr>
+                <w:noProof/>
+                <w:webHidden/>
+              </w:rPr>
+              <w:fldChar w:fldCharType="begin"/>
+            </w:r>
+            <w:r>
+              <w:rPr>
+                <w:noProof/>
+                <w:webHidden/>
+              </w:rPr>
+              <w:instrText xml:space="preserve"> PAGEREF _Toc241689378 \h </w:instrText>
+            </w:r>
+            <w:r>
+              <w:rPr>
+                <w:noProof/>
+                <w:webHidden/>
+              </w:rPr>
+            </w:r>
+            <w:r>
+              <w:rPr>
+                <w:noProof/>
+                <w:webHidden/>
+              </w:rPr>
+              <w:fldChar w:fldCharType="separate"/>
+            </w:r>
+            <w:r>
+              <w:rPr>
+                <w:noProof/>
+                <w:webHidden/>
+              </w:rPr>
+              <w:t>15</w:t>
             </w:r>
             <w:r>
               <w:rPr>
@@ -4600,8 +4779,6 @@
     </w:p>
     <w:p/>
     <w:p/>
-    <w:p/>
-    <w:p/>
     <w:p>
       <w:pPr>
         <w:pStyle w:val="Heading2"/>
@@ -4611,7 +4788,7 @@
       <w:pPr>
         <w:pStyle w:val="Heading1"/>
       </w:pPr>
-      <w:bookmarkStart w:id="15" w:name="_Toc241314098"/>
+      <w:bookmarkStart w:id="22" w:name="_Toc241689359"/>
       <w:r>
         <w:t xml:space="preserve">What I </w:t>
       </w:r>
@@ -4621,18 +4798,18 @@
       <w:r>
         <w:t xml:space="preserve"> applied to the 15-slide puzzle</w:t>
       </w:r>
-      <w:bookmarkEnd w:id="15"/>
+      <w:bookmarkEnd w:id="22"/>
     </w:p>
     <w:p/>
     <w:p>
       <w:pPr>
         <w:pStyle w:val="Heading2"/>
       </w:pPr>
-      <w:bookmarkStart w:id="16" w:name="_Toc241314099"/>
+      <w:bookmarkStart w:id="23" w:name="_Toc241689360"/>
       <w:r>
         <w:t>Algorithm Explanation</w:t>
       </w:r>
-      <w:bookmarkEnd w:id="16"/>
+      <w:bookmarkEnd w:id="23"/>
     </w:p>
     <w:p/>
     <w:p>
@@ -4671,6 +4848,9 @@
       </w:r>
       <w:r>
         <w:t xml:space="preserve">information on how far it has travelled already and an estimated remaining distance. </w:t>
+      </w:r>
+      <w:r>
+        <w:t>(Hart et al., 1968)</w:t>
       </w:r>
     </w:p>
     <w:p/>
@@ -4926,13 +5106,33 @@
         </w:numPr>
       </w:pPr>
       <w:r>
-        <w:t>Dijkstra's algorithm only uses g (ignores h)</w:t>
+        <w:t xml:space="preserve">Dijkstra's </w:t>
+      </w:r>
+      <w:proofErr w:type="gramStart"/>
+      <w:r>
+        <w:t>algorithm</w:t>
+      </w:r>
+      <w:r>
+        <w:t xml:space="preserve"> </w:t>
+      </w:r>
+      <w:r>
+        <w:t xml:space="preserve"> only</w:t>
+      </w:r>
+      <w:proofErr w:type="gramEnd"/>
+      <w:r>
+        <w:t xml:space="preserve"> uses g (ignores h)</w:t>
       </w:r>
       <w:r>
         <w:t>. G</w:t>
       </w:r>
       <w:r>
         <w:t>uaranteed correct but explores in all directions equally, wasting time.</w:t>
+      </w:r>
+      <w:r>
+        <w:t xml:space="preserve"> </w:t>
+      </w:r>
+      <w:r>
+        <w:t>(Dijkstra, 1959)</w:t>
       </w:r>
     </w:p>
     <w:p>
@@ -4972,27 +5172,26 @@
       </w:r>
     </w:p>
     <w:p/>
-    <w:p/>
     <w:p>
       <w:pPr>
         <w:pStyle w:val="Heading2"/>
       </w:pPr>
-      <w:bookmarkStart w:id="17" w:name="_Toc241314100"/>
+      <w:bookmarkStart w:id="24" w:name="_Toc241689361"/>
       <w:r>
         <w:t>Design Choices</w:t>
       </w:r>
-      <w:bookmarkEnd w:id="17"/>
+      <w:bookmarkEnd w:id="24"/>
     </w:p>
     <w:p/>
     <w:p>
       <w:pPr>
         <w:pStyle w:val="Heading3"/>
       </w:pPr>
-      <w:bookmarkStart w:id="18" w:name="_Toc241314101"/>
+      <w:bookmarkStart w:id="25" w:name="_Toc241689362"/>
       <w:r>
         <w:t>Programming Language</w:t>
       </w:r>
-      <w:bookmarkEnd w:id="18"/>
+      <w:bookmarkEnd w:id="25"/>
     </w:p>
     <w:p/>
     <w:p>
@@ -5041,9 +5240,11 @@
           <w:numId w:val="35"/>
         </w:numPr>
       </w:pPr>
+      <w:proofErr w:type="spellStart"/>
       <w:r>
         <w:t>priority_queue</w:t>
       </w:r>
+      <w:proofErr w:type="spellEnd"/>
     </w:p>
     <w:p>
       <w:pPr>
@@ -5053,9 +5254,11 @@
           <w:numId w:val="35"/>
         </w:numPr>
       </w:pPr>
+      <w:proofErr w:type="spellStart"/>
       <w:r>
         <w:t>unordered_map</w:t>
       </w:r>
+      <w:proofErr w:type="spellEnd"/>
     </w:p>
     <w:p>
       <w:pPr>
@@ -5074,11 +5277,11 @@
       <w:pPr>
         <w:pStyle w:val="Heading3"/>
       </w:pPr>
-      <w:bookmarkStart w:id="19" w:name="_Toc241314102"/>
+      <w:bookmarkStart w:id="26" w:name="_Toc241689363"/>
       <w:r>
         <w:t>Data Representation</w:t>
       </w:r>
-      <w:bookmarkEnd w:id="19"/>
+      <w:bookmarkEnd w:id="26"/>
     </w:p>
     <w:p/>
     <w:p>
@@ -5110,7 +5313,23 @@
         <w:t xml:space="preserve"> This representation is useful as </w:t>
       </w:r>
       <w:r>
-        <w:t>it can be hashed and used as a key in an unordered_map or unordered_set.</w:t>
+        <w:t xml:space="preserve">it can be hashed and used as a key in an </w:t>
+      </w:r>
+      <w:proofErr w:type="spellStart"/>
+      <w:r>
+        <w:t>unordered_map</w:t>
+      </w:r>
+      <w:proofErr w:type="spellEnd"/>
+      <w:r>
+        <w:t xml:space="preserve"> or </w:t>
+      </w:r>
+      <w:proofErr w:type="spellStart"/>
+      <w:r>
+        <w:t>unordered_set</w:t>
+      </w:r>
+      <w:proofErr w:type="spellEnd"/>
+      <w:r>
+        <w:t>.</w:t>
       </w:r>
     </w:p>
     <w:p/>
@@ -5123,7 +5342,15 @@
         <w:t xml:space="preserve"> but represents a 2D grid, the column and row numbers of </w:t>
       </w:r>
       <w:r>
-        <w:t>an index ‘i’</w:t>
+        <w:t>an index ‘</w:t>
+      </w:r>
+      <w:proofErr w:type="spellStart"/>
+      <w:r>
+        <w:t>i</w:t>
+      </w:r>
+      <w:proofErr w:type="spellEnd"/>
+      <w:r>
+        <w:t>’</w:t>
       </w:r>
       <w:r>
         <w:t xml:space="preserve"> are determined by:</w:t>
@@ -5138,7 +5365,15 @@
         </w:numPr>
       </w:pPr>
       <w:r>
-        <w:t xml:space="preserve">row = i / </w:t>
+        <w:t xml:space="preserve">row = </w:t>
+      </w:r>
+      <w:proofErr w:type="spellStart"/>
+      <w:r>
+        <w:t>i</w:t>
+      </w:r>
+      <w:proofErr w:type="spellEnd"/>
+      <w:r>
+        <w:t xml:space="preserve"> / </w:t>
       </w:r>
       <w:r>
         <w:t>4</w:t>
@@ -5153,7 +5388,15 @@
         </w:numPr>
       </w:pPr>
       <w:r>
-        <w:t>col = i % 4</w:t>
+        <w:t xml:space="preserve">col = </w:t>
+      </w:r>
+      <w:proofErr w:type="spellStart"/>
+      <w:r>
+        <w:t>i</w:t>
+      </w:r>
+      <w:proofErr w:type="spellEnd"/>
+      <w:r>
+        <w:t xml:space="preserve"> % 4</w:t>
       </w:r>
     </w:p>
     <w:p/>
@@ -5161,17 +5404,48 @@
       <w:r>
         <w:t>These values are required for the calculation of the Manhattan-distance heuristic.</w:t>
       </w:r>
-    </w:p>
-    <w:p/>
-    <w:p>
-      <w:r>
-        <w:t xml:space="preserve">A move is represented by an enum, with Up, Down, Left and Right. </w:t>
+      <w:r>
+        <w:t xml:space="preserve"> </w:t>
+      </w:r>
+      <w:r>
+        <w:t xml:space="preserve">Manhattan distance sums for every tile how many rows + columns </w:t>
+      </w:r>
+      <w:r>
+        <w:t>a puzzle state</w:t>
+      </w:r>
+      <w:r>
+        <w:t xml:space="preserve"> is from the goal position</w:t>
+      </w:r>
+      <w:r>
+        <w:t>.</w:t>
+      </w:r>
+    </w:p>
+    <w:p/>
+    <w:p>
+      <w:r>
+        <w:t xml:space="preserve">A move is represented by an </w:t>
+      </w:r>
+      <w:proofErr w:type="spellStart"/>
+      <w:r>
+        <w:t>enum</w:t>
+      </w:r>
+      <w:proofErr w:type="spellEnd"/>
+      <w:r>
+        <w:t xml:space="preserve">, with Up, Down, Left and Right. </w:t>
       </w:r>
       <w:r>
         <w:t>A move means moving the ‘0’ (blank tile) one space in that direction.</w:t>
       </w:r>
       <w:r>
-        <w:t xml:space="preserve"> Internally this is done using std::swap. </w:t>
+        <w:t xml:space="preserve"> Internally this is done using </w:t>
+      </w:r>
+      <w:proofErr w:type="gramStart"/>
+      <w:r>
+        <w:t>std::</w:t>
+      </w:r>
+      <w:proofErr w:type="gramEnd"/>
+      <w:r>
+        <w:t xml:space="preserve">swap. </w:t>
       </w:r>
     </w:p>
     <w:p/>
@@ -5189,7 +5463,15 @@
         <w:t xml:space="preserve">The board itself does not contain enough information for the A* algorithm to operate. </w:t>
       </w:r>
       <w:r>
-        <w:t>Therefore, a struct ‘SearchNode’</w:t>
+        <w:t>Therefore, a struct ‘</w:t>
+      </w:r>
+      <w:proofErr w:type="spellStart"/>
+      <w:r>
+        <w:t>SearchNode</w:t>
+      </w:r>
+      <w:proofErr w:type="spellEnd"/>
+      <w:r>
+        <w:t>’</w:t>
       </w:r>
       <w:r>
         <w:t>, containing the PuzzleState, cost from start</w:t>
@@ -5269,10 +5551,26 @@
     <w:p/>
     <w:p>
       <w:r>
-        <w:t xml:space="preserve">An unordered_map </w:t>
-      </w:r>
-      <w:r>
-        <w:t xml:space="preserve">‘bestCost’ stores PuzzleState and lowest known </w:t>
+        <w:t xml:space="preserve">An </w:t>
+      </w:r>
+      <w:proofErr w:type="spellStart"/>
+      <w:r>
+        <w:t>unordered_map</w:t>
+      </w:r>
+      <w:proofErr w:type="spellEnd"/>
+      <w:r>
+        <w:t xml:space="preserve"> </w:t>
+      </w:r>
+      <w:r>
+        <w:t>‘</w:t>
+      </w:r>
+      <w:proofErr w:type="spellStart"/>
+      <w:r>
+        <w:t>bestCost</w:t>
+      </w:r>
+      <w:proofErr w:type="spellEnd"/>
+      <w:r>
+        <w:t xml:space="preserve">’ stores PuzzleState and lowest known </w:t>
       </w:r>
       <m:oMath>
         <m:r>
@@ -5370,7 +5668,15 @@
     <w:p/>
     <w:p>
       <w:r>
-        <w:t>The key design decision is that the board state is independent of the search information. The same PuzzleState can be encountered by multiple search nodes, potentially through different paths, which is why bestCost and the parent pointer are kept separately.</w:t>
+        <w:t xml:space="preserve">The key design decision is that the board state is independent of the search information. The same PuzzleState can be encountered by multiple search nodes, potentially through different paths, which is why </w:t>
+      </w:r>
+      <w:proofErr w:type="spellStart"/>
+      <w:r>
+        <w:t>bestCost</w:t>
+      </w:r>
+      <w:proofErr w:type="spellEnd"/>
+      <w:r>
+        <w:t xml:space="preserve"> and the parent pointer are kept separately.</w:t>
       </w:r>
     </w:p>
     <w:p/>
@@ -5379,11 +5685,11 @@
       <w:pPr>
         <w:pStyle w:val="Heading3"/>
       </w:pPr>
-      <w:bookmarkStart w:id="20" w:name="_Toc241314103"/>
+      <w:bookmarkStart w:id="27" w:name="_Toc241689364"/>
       <w:r>
         <w:t>Simplifications and Extensions</w:t>
       </w:r>
-      <w:bookmarkEnd w:id="20"/>
+      <w:bookmarkEnd w:id="27"/>
     </w:p>
     <w:p/>
     <w:p>
@@ -5391,7 +5697,13 @@
         <w:t xml:space="preserve">An extension </w:t>
       </w:r>
       <w:r>
-        <w:t xml:space="preserve">that I decided to add was a Manhattan-linear distance heuristic. </w:t>
+        <w:t xml:space="preserve">that I decided to add was a Manhattan-linear </w:t>
+      </w:r>
+      <w:r>
+        <w:t>conflict</w:t>
+      </w:r>
+      <w:r>
+        <w:t xml:space="preserve"> heuristic. </w:t>
       </w:r>
       <w:r>
         <w:t xml:space="preserve">Manhattan distance sums for </w:t>
@@ -5420,6 +5732,12 @@
       <w:r>
         <w:t xml:space="preserve">overestimates, because a tile cannot need fewer moves than its straight-line distance to the goal. </w:t>
       </w:r>
+      <w:r>
+        <w:t>(Russell</w:t>
+      </w:r>
+      <w:r>
+        <w:t xml:space="preserve"> &amp; Norvig, 2021)</w:t>
+      </w:r>
     </w:p>
     <w:p/>
     <w:p>
@@ -5442,10 +5760,6 @@
         <w:t xml:space="preserve">A linear conflict happens when </w:t>
       </w:r>
       <w:r>
-        <w:rPr>
-          <w:b/>
-          <w:bCs/>
-        </w:rPr>
         <w:t>two tiles</w:t>
       </w:r>
       <w:r>
@@ -5460,14 +5774,13 @@
         </w:numPr>
       </w:pPr>
       <w:r>
-        <w:t xml:space="preserve">are both currently in the same row (or column), </w:t>
-      </w:r>
-      <w:r>
-        <w:rPr>
-          <w:b/>
-          <w:bCs/>
-        </w:rPr>
-        <w:t>and</w:t>
+        <w:t>A</w:t>
+      </w:r>
+      <w:r>
+        <w:t>re both currently in the same row (or column)</w:t>
+      </w:r>
+      <w:r>
+        <w:t>.</w:t>
       </w:r>
     </w:p>
     <w:p>
@@ -5478,24 +5791,19 @@
         </w:numPr>
       </w:pPr>
       <w:r>
-        <w:t xml:space="preserve">both </w:t>
-      </w:r>
-      <w:r>
-        <w:rPr>
-          <w:i/>
-          <w:iCs/>
-        </w:rPr>
+        <w:t>B</w:t>
+      </w:r>
+      <w:r>
+        <w:t xml:space="preserve">oth </w:t>
+      </w:r>
+      <w:r>
         <w:t>belong</w:t>
       </w:r>
       <w:r>
-        <w:t xml:space="preserve"> in that same row (or column) in the goal state, </w:t>
-      </w:r>
-      <w:r>
-        <w:rPr>
-          <w:b/>
-          <w:bCs/>
-        </w:rPr>
-        <w:t>and</w:t>
+        <w:t xml:space="preserve"> in that same row (or column) in the goal state</w:t>
+      </w:r>
+      <w:r>
+        <w:t>.</w:t>
       </w:r>
     </w:p>
     <w:p>
@@ -5506,13 +5814,12 @@
         </w:numPr>
       </w:pPr>
       <w:r>
-        <w:t xml:space="preserve">are in the </w:t>
-      </w:r>
-      <w:r>
-        <w:rPr>
-          <w:i/>
-          <w:iCs/>
-        </w:rPr>
+        <w:t>A</w:t>
+      </w:r>
+      <w:r>
+        <w:t xml:space="preserve">re in the </w:t>
+      </w:r>
+      <w:r>
         <w:t>wrong order</w:t>
       </w:r>
       <w:r>
@@ -5532,19 +5839,29 @@
         <w:t>. O</w:t>
       </w:r>
       <w:r>
-        <w:t>ne of them has to step out of the line to let the other pass, then step back in.</w:t>
-      </w:r>
-    </w:p>
-    <w:p/>
-    <w:p/>
-    <w:p/>
-    <w:p/>
+        <w:t xml:space="preserve">ne of them </w:t>
+      </w:r>
+      <w:r>
+        <w:t>must</w:t>
+      </w:r>
+      <w:r>
+        <w:t xml:space="preserve"> step out of the line to let the other pass, then step back in.</w:t>
+      </w:r>
+    </w:p>
+    <w:p>
+      <w:r>
+        <w:t xml:space="preserve">The implementation remains very similar to the original concept of A* search, with the focus being on creating a </w:t>
+      </w:r>
+      <w:r>
+        <w:t xml:space="preserve">tool to showcase the algorithm as designed. </w:t>
+      </w:r>
+    </w:p>
     <w:p/>
     <w:p>
       <w:pPr>
         <w:pStyle w:val="Heading1"/>
       </w:pPr>
-      <w:bookmarkStart w:id="21" w:name="_Toc241314104"/>
+      <w:bookmarkStart w:id="28" w:name="_Toc241689365"/>
       <w:r>
         <w:t>T</w:t>
       </w:r>
@@ -5554,7 +5871,7 @@
       <w:r>
         <w:t>: The Tool</w:t>
       </w:r>
-      <w:bookmarkEnd w:id="21"/>
+      <w:bookmarkEnd w:id="28"/>
     </w:p>
     <w:p/>
     <w:p>
@@ -5835,11 +6152,11 @@
       <w:pPr>
         <w:pStyle w:val="Heading2"/>
       </w:pPr>
-      <w:bookmarkStart w:id="22" w:name="_Toc241314105"/>
+      <w:bookmarkStart w:id="29" w:name="_Toc241689366"/>
       <w:r>
         <w:t>How the Algorithm Sits Inside the Tool</w:t>
       </w:r>
-      <w:bookmarkEnd w:id="22"/>
+      <w:bookmarkEnd w:id="29"/>
     </w:p>
     <w:p/>
     <w:p>
@@ -5880,7 +6197,15 @@
     <w:p/>
     <w:p>
       <w:r>
-        <w:t>The implementation also maintains the best known cost for previously encountered states. This prevents the algorithm from repeatedly exploring the same configuration through more expensive paths.</w:t>
+        <w:t xml:space="preserve">The implementation also maintains the </w:t>
+      </w:r>
+      <w:proofErr w:type="gramStart"/>
+      <w:r>
+        <w:t>best known</w:t>
+      </w:r>
+      <w:proofErr w:type="gramEnd"/>
+      <w:r>
+        <w:t xml:space="preserve"> cost for previously encountered states. This prevents the algorithm from repeatedly exploring the same configuration through more expensive paths.</w:t>
       </w:r>
     </w:p>
     <w:p/>
@@ -5902,11 +6227,11 @@
       <w:pPr>
         <w:pStyle w:val="Heading2"/>
       </w:pPr>
-      <w:bookmarkStart w:id="23" w:name="_Toc241314106"/>
+      <w:bookmarkStart w:id="30" w:name="_Toc241689367"/>
       <w:r>
         <w:t>Interface Decisions</w:t>
       </w:r>
-      <w:bookmarkEnd w:id="23"/>
+      <w:bookmarkEnd w:id="30"/>
     </w:p>
     <w:p>
       <w:r>
@@ -5941,22 +6266,24 @@
       <w:pPr>
         <w:pStyle w:val="Heading2"/>
       </w:pPr>
-      <w:bookmarkStart w:id="24" w:name="_Toc241314107"/>
+      <w:bookmarkStart w:id="31" w:name="_Toc241689368"/>
       <w:r>
         <w:t>Worked Example</w:t>
       </w:r>
-      <w:bookmarkEnd w:id="24"/>
+      <w:bookmarkEnd w:id="31"/>
     </w:p>
     <w:p/>
     <w:p>
       <w:pPr>
         <w:pStyle w:val="Heading3"/>
       </w:pPr>
-      <w:bookmarkStart w:id="25" w:name="_Toc241314108"/>
+      <w:bookmarkStart w:id="32" w:name="_Toc241314108"/>
+      <w:bookmarkStart w:id="33" w:name="_Toc241689369"/>
       <w:r>
         <w:t>The setup</w:t>
       </w:r>
-      <w:bookmarkEnd w:id="25"/>
+      <w:bookmarkEnd w:id="32"/>
+      <w:bookmarkEnd w:id="33"/>
     </w:p>
     <w:p/>
     <w:p>
@@ -6699,11 +7026,13 @@
       <w:pPr>
         <w:pStyle w:val="Heading3"/>
       </w:pPr>
-      <w:bookmarkStart w:id="26" w:name="_Toc241314109"/>
+      <w:bookmarkStart w:id="34" w:name="_Toc241314109"/>
+      <w:bookmarkStart w:id="35" w:name="_Toc241689370"/>
       <w:r>
         <w:t>Step 1: Expand start node</w:t>
       </w:r>
-      <w:bookmarkEnd w:id="26"/>
+      <w:bookmarkEnd w:id="34"/>
+      <w:bookmarkEnd w:id="35"/>
     </w:p>
     <w:p/>
     <w:p>
@@ -7258,11 +7587,13 @@
       <w:pPr>
         <w:pStyle w:val="Heading3"/>
       </w:pPr>
-      <w:bookmarkStart w:id="27" w:name="_Toc241314110"/>
+      <w:bookmarkStart w:id="36" w:name="_Toc241314110"/>
+      <w:bookmarkStart w:id="37" w:name="_Toc241689371"/>
       <w:r>
         <w:t>Step 2: Pop the lowest-f node</w:t>
       </w:r>
-      <w:bookmarkEnd w:id="27"/>
+      <w:bookmarkEnd w:id="36"/>
+      <w:bookmarkEnd w:id="37"/>
     </w:p>
     <w:p/>
     <w:p>
@@ -7365,11 +7696,13 @@
       <w:pPr>
         <w:pStyle w:val="Heading3"/>
       </w:pPr>
-      <w:bookmarkStart w:id="28" w:name="_Toc241314111"/>
+      <w:bookmarkStart w:id="38" w:name="_Toc241314111"/>
+      <w:bookmarkStart w:id="39" w:name="_Toc241689372"/>
       <w:r>
         <w:t>Step 3: Pop Again</w:t>
       </w:r>
-      <w:bookmarkEnd w:id="28"/>
+      <w:bookmarkEnd w:id="38"/>
+      <w:bookmarkEnd w:id="39"/>
     </w:p>
     <w:p/>
     <w:p>
@@ -7397,61 +7730,59 @@
       </w:r>
     </w:p>
     <w:p>
-      <w:pPr>
+      <w:r>
+        <w:t>What this demonstrates</w:t>
+      </w:r>
+      <w:r>
+        <w:t>:</w:t>
+      </w:r>
+    </w:p>
+    <w:p>
+      <w:pPr>
+        <w:numPr>
+          <w:ilvl w:val="0"/>
+          <w:numId w:val="40"/>
+        </w:numPr>
+      </w:pPr>
+      <w:r>
+        <w:t>Only 2 nodes were ever expanded</w:t>
+      </w:r>
+      <w:r>
+        <w:t xml:space="preserve"> (Start, then Right) out of 6 generated, because the heuristic correctly steered the search away from the three </w:t>
+      </w:r>
+      <w:r>
+        <w:t>ineffective</w:t>
+      </w:r>
+      <w:r>
+        <w:t xml:space="preserve"> siblings at the first branch.</w:t>
+      </w:r>
+    </w:p>
+    <w:p>
+      <w:pPr>
+        <w:numPr>
+          <w:ilvl w:val="0"/>
+          <w:numId w:val="40"/>
+        </w:numPr>
+      </w:pPr>
+      <w:r>
+        <w:t xml:space="preserve">The path is reconstructed by walking parent pointers backward: Down ← Right ← Start, then reversed to give the move order </w:t>
+      </w:r>
+      <w:r>
         <w:rPr>
           <w:b/>
           <w:bCs/>
         </w:rPr>
-      </w:pPr>
+        <w:t xml:space="preserve">Right, </w:t>
+      </w:r>
+      <w:proofErr w:type="gramStart"/>
       <w:r>
         <w:rPr>
           <w:b/>
           <w:bCs/>
         </w:rPr>
-        <w:t>What this demonstrates</w:t>
-      </w:r>
-    </w:p>
-    <w:p>
-      <w:pPr>
-        <w:numPr>
-          <w:ilvl w:val="0"/>
-          <w:numId w:val="40"/>
-        </w:numPr>
-      </w:pPr>
-      <w:r>
-        <w:rPr>
-          <w:b/>
-          <w:bCs/>
-        </w:rPr>
-        <w:t>Only 2 nodes were ever expanded</w:t>
-      </w:r>
-      <w:r>
-        <w:t xml:space="preserve"> (Start, then Right) out of 6 generated, because the heuristic correctly steered the search away from the three </w:t>
-      </w:r>
-      <w:r>
-        <w:t>ineffective</w:t>
-      </w:r>
-      <w:r>
-        <w:t xml:space="preserve"> siblings at the first branch.</w:t>
-      </w:r>
-    </w:p>
-    <w:p>
-      <w:pPr>
-        <w:numPr>
-          <w:ilvl w:val="0"/>
-          <w:numId w:val="40"/>
-        </w:numPr>
-      </w:pPr>
-      <w:r>
-        <w:t xml:space="preserve">The path is reconstructed by walking parent pointers backward: Down ← Right ← Start, then reversed to give the move order </w:t>
-      </w:r>
-      <w:r>
-        <w:rPr>
-          <w:b/>
-          <w:bCs/>
-        </w:rPr>
-        <w:t>Right, Down</w:t>
-      </w:r>
+        <w:t>Down</w:t>
+      </w:r>
+      <w:proofErr w:type="gramEnd"/>
       <w:r>
         <w:t>.</w:t>
       </w:r>
@@ -7530,11 +7861,11 @@
       <w:pPr>
         <w:pStyle w:val="Heading2"/>
       </w:pPr>
-      <w:bookmarkStart w:id="29" w:name="_Toc241314112"/>
+      <w:bookmarkStart w:id="40" w:name="_Toc241689373"/>
       <w:r>
         <w:t>Summary</w:t>
       </w:r>
-      <w:bookmarkEnd w:id="29"/>
+      <w:bookmarkEnd w:id="40"/>
     </w:p>
     <w:p>
       <w:r>
@@ -7594,11 +7925,11 @@
       <w:pPr>
         <w:pStyle w:val="Heading1"/>
       </w:pPr>
-      <w:bookmarkStart w:id="30" w:name="_Toc241314113"/>
+      <w:bookmarkStart w:id="41" w:name="_Toc241689374"/>
       <w:r>
         <w:t>What I Learned:</w:t>
       </w:r>
-      <w:bookmarkEnd w:id="30"/>
+      <w:bookmarkEnd w:id="41"/>
     </w:p>
     <w:p/>
     <w:p/>
@@ -7681,10 +8012,31 @@
         <w:t>a</w:t>
       </w:r>
       <w:r>
-        <w:t xml:space="preserve">n std::unordered_map </w:t>
-      </w:r>
-      <w:r>
-        <w:t xml:space="preserve">(bestCost) </w:t>
+        <w:t xml:space="preserve">n </w:t>
+      </w:r>
+      <w:proofErr w:type="gramStart"/>
+      <w:r>
+        <w:t>std::</w:t>
+      </w:r>
+      <w:proofErr w:type="spellStart"/>
+      <w:proofErr w:type="gramEnd"/>
+      <w:r>
+        <w:t>unordered_map</w:t>
+      </w:r>
+      <w:proofErr w:type="spellEnd"/>
+      <w:r>
+        <w:t xml:space="preserve"> </w:t>
+      </w:r>
+      <w:r>
+        <w:t>(</w:t>
+      </w:r>
+      <w:proofErr w:type="spellStart"/>
+      <w:r>
+        <w:t>bestCost</w:t>
+      </w:r>
+      <w:proofErr w:type="spellEnd"/>
+      <w:r>
+        <w:t xml:space="preserve">) </w:t>
       </w:r>
       <w:r>
         <w:t xml:space="preserve">in the algorithm that keeps track of the best score for visited states. </w:t>
@@ -7748,8 +8100,18 @@
       <w:r>
         <w:t xml:space="preserve">consultation with GenAI models I learnt how the path reconstruction functions. </w:t>
       </w:r>
-      <w:r>
-        <w:t xml:space="preserve">std::shared_ptr is required as a search node can be referenced by </w:t>
+      <w:proofErr w:type="gramStart"/>
+      <w:r>
+        <w:t>std::</w:t>
+      </w:r>
+      <w:proofErr w:type="spellStart"/>
+      <w:proofErr w:type="gramEnd"/>
+      <w:r>
+        <w:t>shared_ptr</w:t>
+      </w:r>
+      <w:proofErr w:type="spellEnd"/>
+      <w:r>
+        <w:t xml:space="preserve"> is required as a search node can be referenced by </w:t>
       </w:r>
       <w:r>
         <w:t>several parts of the search process.</w:t>
@@ -7788,7 +8150,15 @@
         <w:t xml:space="preserve">Manhattan distance only. During consultation with AI while the tool was being built, </w:t>
       </w:r>
       <w:r>
-        <w:t>I came across Manhattan-linear conflict. I learnt that this heuristic is actually more effective than regular Manhattan distance</w:t>
+        <w:t xml:space="preserve">I came across Manhattan-linear conflict. I learnt that this heuristic is </w:t>
+      </w:r>
+      <w:proofErr w:type="gramStart"/>
+      <w:r>
+        <w:t>actually more</w:t>
+      </w:r>
+      <w:proofErr w:type="gramEnd"/>
+      <w:r>
+        <w:t xml:space="preserve"> effective than regular Manhattan distance</w:t>
       </w:r>
       <w:r>
         <w:t xml:space="preserve"> due to the incorrect assumption</w:t>
@@ -7852,22 +8222,22 @@
       <w:pPr>
         <w:pStyle w:val="Heading1"/>
       </w:pPr>
-      <w:bookmarkStart w:id="31" w:name="_Toc241314114"/>
+      <w:bookmarkStart w:id="42" w:name="_Toc241689375"/>
       <w:r>
         <w:t>AI Usage</w:t>
       </w:r>
-      <w:bookmarkEnd w:id="31"/>
+      <w:bookmarkEnd w:id="42"/>
     </w:p>
     <w:p/>
     <w:p>
       <w:pPr>
         <w:pStyle w:val="Heading2"/>
       </w:pPr>
-      <w:bookmarkStart w:id="32" w:name="_Toc241314115"/>
+      <w:bookmarkStart w:id="43" w:name="_Toc241689376"/>
       <w:r>
         <w:t>AI Development Log:</w:t>
       </w:r>
-      <w:bookmarkEnd w:id="32"/>
+      <w:bookmarkEnd w:id="43"/>
     </w:p>
     <w:p/>
     <w:p>
@@ -8060,8 +8430,13 @@
       <w:r>
         <w:t xml:space="preserve">I was originally unaware that is possibility existed and adjusted my plan. Correctness was not an issue as it was a </w:t>
       </w:r>
-      <w:r>
-        <w:t xml:space="preserve">fairly shallow context level prompt. </w:t>
+      <w:proofErr w:type="gramStart"/>
+      <w:r>
+        <w:t>fairly shallow</w:t>
+      </w:r>
+      <w:proofErr w:type="gramEnd"/>
+      <w:r>
+        <w:t xml:space="preserve"> context level prompt. </w:t>
       </w:r>
       <w:r>
         <w:t xml:space="preserve">It also </w:t>
@@ -8266,7 +8641,15 @@
         <w:t xml:space="preserve">incorrect lines in the generated output. </w:t>
       </w:r>
       <w:r>
-        <w:t xml:space="preserve">ChatGPT had used “shared_ptr” </w:t>
+        <w:t>ChatGPT had used “</w:t>
+      </w:r>
+      <w:proofErr w:type="spellStart"/>
+      <w:r>
+        <w:t>shared_ptr</w:t>
+      </w:r>
+      <w:proofErr w:type="spellEnd"/>
+      <w:r>
+        <w:t xml:space="preserve">” </w:t>
       </w:r>
       <w:r>
         <w:t xml:space="preserve">without </w:t>
@@ -8289,7 +8672,15 @@
     </w:p>
     <w:p>
       <w:r>
-        <w:t>The inclusion of the solvability check was very unclear as to what it was actually doing,</w:t>
+        <w:t xml:space="preserve">The inclusion of the solvability check was very unclear as to what it was </w:t>
+      </w:r>
+      <w:proofErr w:type="gramStart"/>
+      <w:r>
+        <w:t>actually doing</w:t>
+      </w:r>
+      <w:proofErr w:type="gramEnd"/>
+      <w:r>
+        <w:t>,</w:t>
       </w:r>
       <w:r>
         <w:t xml:space="preserve"> as there was no explanation as to how it works.</w:t>
@@ -8384,8 +8775,13 @@
         </w:rPr>
         <w:t xml:space="preserve">What I accepted: </w:t>
       </w:r>
-      <w:r>
-        <w:t>All of this reasoning.</w:t>
+      <w:proofErr w:type="gramStart"/>
+      <w:r>
+        <w:t>All of</w:t>
+      </w:r>
+      <w:proofErr w:type="gramEnd"/>
+      <w:r>
+        <w:t xml:space="preserve"> this reasoning.</w:t>
       </w:r>
       <w:r>
         <w:t xml:space="preserve"> </w:t>
@@ -8994,10 +9390,7 @@
         <w:t xml:space="preserve">Date: </w:t>
       </w:r>
       <w:r>
-        <w:t>2</w:t>
-      </w:r>
-      <w:r>
-        <w:t>6</w:t>
+        <w:t>26</w:t>
       </w:r>
       <w:r>
         <w:t>/9</w:t>
@@ -9033,13 +9426,7 @@
         <w:t xml:space="preserve">What I asked: </w:t>
       </w:r>
       <w:r>
-        <w:t xml:space="preserve">Generate a </w:t>
-      </w:r>
-      <w:r>
-        <w:t>readme file for the project</w:t>
-      </w:r>
-      <w:r>
-        <w:t>.</w:t>
+        <w:t>Generate a readme file for the project.</w:t>
       </w:r>
     </w:p>
     <w:p>
@@ -9059,13 +9446,7 @@
         <w:t xml:space="preserve">What it suggested: </w:t>
       </w:r>
       <w:r>
-        <w:t xml:space="preserve">A </w:t>
-      </w:r>
-      <w:r>
-        <w:t>comprehensive readme file</w:t>
-      </w:r>
-      <w:r>
-        <w:t>.</w:t>
+        <w:t>A comprehensive readme file.</w:t>
       </w:r>
     </w:p>
     <w:p>
@@ -9155,11 +9536,11 @@
       <w:pPr>
         <w:pStyle w:val="Heading2"/>
       </w:pPr>
-      <w:bookmarkStart w:id="33" w:name="_Toc241314116"/>
+      <w:bookmarkStart w:id="44" w:name="_Toc241689377"/>
       <w:r>
         <w:t>AI Usage Summary</w:t>
       </w:r>
-      <w:bookmarkEnd w:id="33"/>
+      <w:bookmarkEnd w:id="44"/>
     </w:p>
     <w:p/>
     <w:p>
@@ -9212,7 +9593,15 @@
         <w:t xml:space="preserve">. </w:t>
       </w:r>
       <w:r>
-        <w:t xml:space="preserve">2 specific examples of misleading/incorrect output (mentioned in the AI log) were the incorrect API calling for shared_ptr and a complete lack of justification for </w:t>
+        <w:t xml:space="preserve">2 specific examples of misleading/incorrect output (mentioned in the AI log) were the incorrect API calling for </w:t>
+      </w:r>
+      <w:proofErr w:type="spellStart"/>
+      <w:r>
+        <w:t>shared_ptr</w:t>
+      </w:r>
+      <w:proofErr w:type="spellEnd"/>
+      <w:r>
+        <w:t xml:space="preserve"> and a complete lack of justification for </w:t>
       </w:r>
       <w:r>
         <w:t xml:space="preserve">why Manhattan distance was originally chosen over Manhattan-linear conflict for the original implementation output. </w:t>
@@ -9221,9 +9610,91 @@
         <w:t>Other errors include the generation of the readme file and a lack of explanation of the solvability check.</w:t>
       </w:r>
     </w:p>
+    <w:p/>
+    <w:p/>
+    <w:p/>
+    <w:p/>
+    <w:p/>
+    <w:p/>
+    <w:p/>
+    <w:p/>
+    <w:p/>
+    <w:p/>
+    <w:p/>
+    <w:p>
+      <w:pPr>
+        <w:pStyle w:val="Heading1"/>
+      </w:pPr>
+      <w:bookmarkStart w:id="45" w:name="_Toc241689378"/>
+      <w:r>
+        <w:lastRenderedPageBreak/>
+        <w:t>References</w:t>
+      </w:r>
+      <w:bookmarkEnd w:id="45"/>
+    </w:p>
+    <w:p/>
+    <w:p>
+      <w:r>
+        <w:t xml:space="preserve">Dijkstra, E. W. (1959). A note on two problems in connexion with graphs. </w:t>
+      </w:r>
+      <w:proofErr w:type="spellStart"/>
+      <w:r>
+        <w:t>Numerische</w:t>
+      </w:r>
+      <w:proofErr w:type="spellEnd"/>
+      <w:r>
+        <w:t xml:space="preserve"> </w:t>
+      </w:r>
+      <w:proofErr w:type="spellStart"/>
+      <w:r>
+        <w:t>Mathematik</w:t>
+      </w:r>
+      <w:proofErr w:type="spellEnd"/>
+      <w:r>
+        <w:t xml:space="preserve">, 1(1), 269–271. </w:t>
+      </w:r>
+      <w:hyperlink r:id="rId20" w:history="1">
+        <w:r>
+          <w:rPr>
+            <w:rStyle w:val="Hyperlink"/>
+          </w:rPr>
+          <w:t>https://doi.org/10.1007/BF01386390</w:t>
+        </w:r>
+      </w:hyperlink>
+    </w:p>
+    <w:p/>
+    <w:p>
+      <w:r>
+        <w:t xml:space="preserve">Hart, P. E., Nilsson, N. J., &amp; Raphael, B. (1968). A formal basis for the heuristic determination of minimum cost paths. </w:t>
+      </w:r>
+      <w:r>
+        <w:rPr>
+          <w:i/>
+          <w:iCs/>
+        </w:rPr>
+        <w:t>IEEE Transactions on Systems Science and Cybernetics, 4</w:t>
+      </w:r>
+      <w:r>
+        <w:t xml:space="preserve">(2), 100–107. </w:t>
+      </w:r>
+      <w:hyperlink r:id="rId21" w:history="1">
+        <w:r>
+          <w:rPr>
+            <w:rStyle w:val="Hyperlink"/>
+          </w:rPr>
+          <w:t>https://doi.org/10.1109/TSSC.1968.300136</w:t>
+        </w:r>
+      </w:hyperlink>
+    </w:p>
+    <w:p/>
+    <w:p>
+      <w:r>
+        <w:t>Russell, S., &amp; Norvig, P. (2021). Artificial intelligence: A modern approach (4th ed.). Pearson.</w:t>
+      </w:r>
+    </w:p>
     <w:sectPr>
-      <w:headerReference w:type="default" r:id="rId20"/>
-      <w:footerReference w:type="default" r:id="rId21"/>
+      <w:headerReference w:type="default" r:id="rId22"/>
+      <w:footerReference w:type="default" r:id="rId23"/>
       <w:pgSz w:w="11899" w:h="16838"/>
       <w:pgMar w:top="720" w:right="720" w:bottom="720" w:left="720" w:header="709" w:footer="709" w:gutter="0"/>
       <w:cols w:space="708"/>
@@ -9542,7 +10013,7 @@
             <w:sz w:val="16"/>
             <w:szCs w:val="12"/>
           </w:rPr>
-          <w:t>26/09/2026</w:t>
+          <w:t>30/09/2026</w:t>
         </w:r>
         <w:r>
           <w:rPr>
@@ -14994,7 +15465,6 @@
   <w:style w:type="character" w:default="1" w:styleId="DefaultParagraphFont">
     <w:name w:val="Default Paragraph Font"/>
     <w:uiPriority w:val="1"/>
-    <w:semiHidden/>
     <w:unhideWhenUsed/>
   </w:style>
   <w:style w:type="table" w:default="1" w:styleId="TableNormal">
@@ -15726,6 +16196,10 @@
 </file>
 
 <file path=customXml/item1.xml><?xml version="1.0" encoding="utf-8"?>
+<b:Sources xmlns:b="http://schemas.openxmlformats.org/officeDocument/2006/bibliography" xmlns="http://schemas.openxmlformats.org/officeDocument/2006/bibliography" SelectedStyle="\APASixthEditionOfficeOnline.xsl" StyleName="APA" Version="6"/>
+</file>
+
+<file path=customXml/item2.xml><?xml version="1.0" encoding="utf-8"?>
 <p:properties xmlns:p="http://schemas.microsoft.com/office/2006/metadata/properties" xmlns:xsi="http://www.w3.org/2001/XMLSchema-instance" xmlns:pc="http://schemas.microsoft.com/office/infopath/2007/PartnerControls">
   <documentManagement>
     <KeyDocument xmlns="599cdadb-518c-4a4c-85ba-dbf7adc631b4">No</KeyDocument>
@@ -15738,20 +16212,7 @@
 </p:properties>
 </file>
 
-<file path=customXml/item2.xml><?xml version="1.0" encoding="utf-8"?>
-<b:Sources xmlns:b="http://schemas.openxmlformats.org/officeDocument/2006/bibliography" xmlns="http://schemas.openxmlformats.org/officeDocument/2006/bibliography" SelectedStyle="\APASixthEditionOfficeOnline.xsl" StyleName="APA" Version="6"/>
-</file>
-
 <file path=customXml/item3.xml><?xml version="1.0" encoding="utf-8"?>
-<?mso-contentType ?>
-<FormTemplates xmlns="http://schemas.microsoft.com/sharepoint/v3/contenttype/forms">
-  <Display>DocumentLibraryForm</Display>
-  <Edit>DocumentLibraryForm</Edit>
-  <New>DocumentLibraryForm</New>
-</FormTemplates>
-</file>
-
-<file path=customXml/item4.xml><?xml version="1.0" encoding="utf-8"?>
 <ct:contentTypeSchema xmlns:ct="http://schemas.microsoft.com/office/2006/metadata/contentType" xmlns:ma="http://schemas.microsoft.com/office/2006/metadata/properties/metaAttributes" ct:_="" ma:_="" ma:contentTypeName="Document" ma:contentTypeID="0x010100D07A8468A96921419EC8CB9BF791CD1B" ma:contentTypeVersion="3" ma:contentTypeDescription="Create a new document." ma:contentTypeScope="" ma:versionID="8e09059436c6d1085ff2e74b3772b035">
   <xsd:schema xmlns:xsd="http://www.w3.org/2001/XMLSchema" xmlns:xs="http://www.w3.org/2001/XMLSchema" xmlns:p="http://schemas.microsoft.com/office/2006/metadata/properties" xmlns:ns1="http://schemas.microsoft.com/sharepoint/v3" xmlns:ns2="eed576b4-51ef-4fde-88aa-d1998b7e86ab" xmlns:ns3="420b5d22-3341-4f60-b4d6-57d88f13fbf6" xmlns:ns4="599cdadb-518c-4a4c-85ba-dbf7adc631b4" targetNamespace="http://schemas.microsoft.com/office/2006/metadata/properties" ma:root="true" ma:fieldsID="ed8dc5b1fb6572d465f2cc67d2746df9" ns1:_="" ns2:_="" ns3:_="" ns4:_="">
     <xsd:import namespace="http://schemas.microsoft.com/sharepoint/v3"/>
@@ -15957,7 +16418,24 @@
 </ct:contentTypeSchema>
 </file>
 
+<file path=customXml/item4.xml><?xml version="1.0" encoding="utf-8"?>
+<?mso-contentType ?>
+<FormTemplates xmlns="http://schemas.microsoft.com/sharepoint/v3/contenttype/forms">
+  <Display>DocumentLibraryForm</Display>
+  <Edit>DocumentLibraryForm</Edit>
+  <New>DocumentLibraryForm</New>
+</FormTemplates>
+</file>
+
 <file path=customXml/itemProps1.xml><?xml version="1.0" encoding="utf-8"?>
+<ds:datastoreItem xmlns:ds="http://schemas.openxmlformats.org/officeDocument/2006/customXml" ds:itemID="{406414B0-3F0B-479C-8EA2-FDEDCB93AF27}">
+  <ds:schemaRefs>
+    <ds:schemaRef ds:uri="http://schemas.openxmlformats.org/officeDocument/2006/bibliography"/>
+  </ds:schemaRefs>
+</ds:datastoreItem>
+</file>
+
+<file path=customXml/itemProps2.xml><?xml version="1.0" encoding="utf-8"?>
 <ds:datastoreItem xmlns:ds="http://schemas.openxmlformats.org/officeDocument/2006/customXml" ds:itemID="{7CEB07B8-A871-4052-983A-0EDE95CB2779}">
   <ds:schemaRefs>
     <ds:schemaRef ds:uri="http://schemas.microsoft.com/office/2006/metadata/properties"/>
@@ -15970,23 +16448,7 @@
 </ds:datastoreItem>
 </file>
 
-<file path=customXml/itemProps2.xml><?xml version="1.0" encoding="utf-8"?>
-<ds:datastoreItem xmlns:ds="http://schemas.openxmlformats.org/officeDocument/2006/customXml" ds:itemID="{406414B0-3F0B-479C-8EA2-FDEDCB93AF27}">
-  <ds:schemaRefs>
-    <ds:schemaRef ds:uri="http://schemas.openxmlformats.org/officeDocument/2006/bibliography"/>
-  </ds:schemaRefs>
-</ds:datastoreItem>
-</file>
-
 <file path=customXml/itemProps3.xml><?xml version="1.0" encoding="utf-8"?>
-<ds:datastoreItem xmlns:ds="http://schemas.openxmlformats.org/officeDocument/2006/customXml" ds:itemID="{69B96D5B-8A15-437D-9C1A-88BF09EE8B43}">
-  <ds:schemaRefs>
-    <ds:schemaRef ds:uri="http://schemas.microsoft.com/sharepoint/v3/contenttype/forms"/>
-  </ds:schemaRefs>
-</ds:datastoreItem>
-</file>
-
-<file path=customXml/itemProps4.xml><?xml version="1.0" encoding="utf-8"?>
 <ds:datastoreItem xmlns:ds="http://schemas.openxmlformats.org/officeDocument/2006/customXml" ds:itemID="{C45E8554-5B65-4B20-8BCC-DCBD8919F0EB}">
   <ds:schemaRefs>
     <ds:schemaRef ds:uri="http://schemas.microsoft.com/office/2006/metadata/contentType"/>
@@ -16005,4 +16467,12 @@
     <ds:schemaRef ds:uri="http://schemas.microsoft.com/internal/obd"/>
   </ds:schemaRefs>
 </ds:datastoreItem>
+</file>
+
+<file path=customXml/itemProps4.xml><?xml version="1.0" encoding="utf-8"?>
+<ds:datastoreItem xmlns:ds="http://schemas.openxmlformats.org/officeDocument/2006/customXml" ds:itemID="{69B96D5B-8A15-437D-9C1A-88BF09EE8B43}">
+  <ds:schemaRefs>
+    <ds:schemaRef ds:uri="http://schemas.microsoft.com/sharepoint/v3/contenttype/forms"/>
+  </ds:schemaRefs>
+</ds:datastoreItem>
 </file>
</xml_diff>